<commit_message>
Remove outdated SQL schema and unused references: delete `table.sql`, clean up `JobEntity.php` properties, and update `.idea/data_source_mapping.xml` to reflect removal.
</commit_message>
<xml_diff>
--- a/Explication sommaire.docx
+++ b/Explication sommaire.docx
@@ -4,6 +4,14 @@
   <w:body>
     <w:sdt>
       <w:sdtPr>
+        <w:rPr>
+          <w:rFonts w:eastAsiaTheme="minorHAnsi"/>
+          <w:kern w:val="2"/>
+          <w:sz w:val="24"/>
+          <w:szCs w:val="24"/>
+          <w:lang w:eastAsia="en-US"/>
+          <w14:ligatures w14:val="standardContextual"/>
+        </w:rPr>
         <w:id w:val="-478994904"/>
         <w:docPartObj>
           <w:docPartGallery w:val="Cover Pages"/>
@@ -12,13 +20,7 @@
       </w:sdtPr>
       <w:sdtEndPr>
         <w:rPr>
-          <w:rFonts w:eastAsiaTheme="minorHAnsi"/>
           <w:noProof/>
-          <w:kern w:val="2"/>
-          <w:sz w:val="24"/>
-          <w:szCs w:val="24"/>
-          <w:lang w:eastAsia="en-US"/>
-          <w14:ligatures w14:val="standardContextual"/>
         </w:rPr>
       </w:sdtEndPr>
       <w:sdtContent>
@@ -3955,7 +3957,7 @@
                                         <w:sz w:val="72"/>
                                         <w:szCs w:val="72"/>
                                       </w:rPr>
-                                      <w:t xml:space="preserve"> Projet de développement WEB – EXAMEN</w:t>
+                                      <w:t>Projet de développement WEB – EXAMEN</w:t>
                                     </w:r>
                                   </w:sdtContent>
                                 </w:sdt>
@@ -4050,7 +4052,7 @@
                                   <w:sz w:val="72"/>
                                   <w:szCs w:val="72"/>
                                 </w:rPr>
-                                <w:t xml:space="preserve"> Projet de développement WEB – EXAMEN</w:t>
+                                <w:t>Projet de développement WEB – EXAMEN</w:t>
                               </w:r>
                             </w:sdtContent>
                           </w:sdt>
@@ -4111,6 +4113,1320 @@
             <w:br w:type="page"/>
           </w:r>
         </w:p>
+        <w:sdt>
+          <w:sdtPr>
+            <w:id w:val="-559555841"/>
+            <w:docPartObj>
+              <w:docPartGallery w:val="Table of Contents"/>
+              <w:docPartUnique/>
+            </w:docPartObj>
+          </w:sdtPr>
+          <w:sdtEndPr>
+            <w:rPr>
+              <w:rFonts w:asciiTheme="minorHAnsi" w:eastAsiaTheme="minorHAnsi" w:hAnsiTheme="minorHAnsi" w:cstheme="minorBidi"/>
+              <w:b/>
+              <w:bCs/>
+              <w:color w:val="auto"/>
+              <w:kern w:val="2"/>
+              <w:sz w:val="24"/>
+              <w:szCs w:val="24"/>
+              <w:lang w:eastAsia="en-US"/>
+              <w14:ligatures w14:val="standardContextual"/>
+            </w:rPr>
+          </w:sdtEndPr>
+          <w:sdtContent>
+            <w:p>
+              <w:pPr>
+                <w:pStyle w:val="En-ttedetabledesmatires"/>
+              </w:pPr>
+              <w:r>
+                <w:t>Table des matières</w:t>
+              </w:r>
+            </w:p>
+            <w:p>
+              <w:pPr>
+                <w:pStyle w:val="TM1"/>
+                <w:tabs>
+                  <w:tab w:val="right" w:leader="dot" w:pos="9062"/>
+                </w:tabs>
+                <w:rPr>
+                  <w:noProof/>
+                </w:rPr>
+              </w:pPr>
+              <w:r>
+                <w:fldChar w:fldCharType="begin"/>
+              </w:r>
+              <w:r>
+                <w:instrText xml:space="preserve"> TOC \o "1-3" \h \z \u </w:instrText>
+              </w:r>
+              <w:r>
+                <w:fldChar w:fldCharType="separate"/>
+              </w:r>
+              <w:hyperlink w:anchor="_Toc230828021" w:history="1">
+                <w:r>
+                  <w:rPr>
+                    <w:rStyle w:val="Lienhypertexte"/>
+                    <w:noProof/>
+                  </w:rPr>
+                  <w:t>Explication sommaire</w:t>
+                </w:r>
+                <w:r>
+                  <w:rPr>
+                    <w:noProof/>
+                    <w:webHidden/>
+                  </w:rPr>
+                  <w:tab/>
+                </w:r>
+                <w:r>
+                  <w:rPr>
+                    <w:noProof/>
+                    <w:webHidden/>
+                  </w:rPr>
+                  <w:fldChar w:fldCharType="begin"/>
+                </w:r>
+                <w:r>
+                  <w:rPr>
+                    <w:noProof/>
+                    <w:webHidden/>
+                  </w:rPr>
+                  <w:instrText xml:space="preserve"> PAGEREF _Toc230828021 \h </w:instrText>
+                </w:r>
+                <w:r>
+                  <w:rPr>
+                    <w:noProof/>
+                    <w:webHidden/>
+                  </w:rPr>
+                </w:r>
+                <w:r>
+                  <w:rPr>
+                    <w:noProof/>
+                    <w:webHidden/>
+                  </w:rPr>
+                  <w:fldChar w:fldCharType="separate"/>
+                </w:r>
+                <w:r>
+                  <w:rPr>
+                    <w:noProof/>
+                    <w:webHidden/>
+                  </w:rPr>
+                  <w:t>2</w:t>
+                </w:r>
+                <w:r>
+                  <w:rPr>
+                    <w:noProof/>
+                    <w:webHidden/>
+                  </w:rPr>
+                  <w:fldChar w:fldCharType="end"/>
+                </w:r>
+              </w:hyperlink>
+            </w:p>
+            <w:p>
+              <w:pPr>
+                <w:pStyle w:val="TM1"/>
+                <w:tabs>
+                  <w:tab w:val="right" w:leader="dot" w:pos="9062"/>
+                </w:tabs>
+                <w:rPr>
+                  <w:noProof/>
+                </w:rPr>
+              </w:pPr>
+              <w:hyperlink w:anchor="_Toc230828022" w:history="1">
+                <w:r>
+                  <w:rPr>
+                    <w:rStyle w:val="Lienhypertexte"/>
+                    <w:noProof/>
+                  </w:rPr>
+                  <w:t>Choix stack</w:t>
+                </w:r>
+                <w:r>
+                  <w:rPr>
+                    <w:noProof/>
+                    <w:webHidden/>
+                  </w:rPr>
+                  <w:tab/>
+                </w:r>
+                <w:r>
+                  <w:rPr>
+                    <w:noProof/>
+                    <w:webHidden/>
+                  </w:rPr>
+                  <w:fldChar w:fldCharType="begin"/>
+                </w:r>
+                <w:r>
+                  <w:rPr>
+                    <w:noProof/>
+                    <w:webHidden/>
+                  </w:rPr>
+                  <w:instrText xml:space="preserve"> PAGEREF _Toc230828022 \h </w:instrText>
+                </w:r>
+                <w:r>
+                  <w:rPr>
+                    <w:noProof/>
+                    <w:webHidden/>
+                  </w:rPr>
+                </w:r>
+                <w:r>
+                  <w:rPr>
+                    <w:noProof/>
+                    <w:webHidden/>
+                  </w:rPr>
+                  <w:fldChar w:fldCharType="separate"/>
+                </w:r>
+                <w:r>
+                  <w:rPr>
+                    <w:noProof/>
+                    <w:webHidden/>
+                  </w:rPr>
+                  <w:t>2</w:t>
+                </w:r>
+                <w:r>
+                  <w:rPr>
+                    <w:noProof/>
+                    <w:webHidden/>
+                  </w:rPr>
+                  <w:fldChar w:fldCharType="end"/>
+                </w:r>
+              </w:hyperlink>
+            </w:p>
+            <w:p>
+              <w:pPr>
+                <w:pStyle w:val="TM2"/>
+                <w:tabs>
+                  <w:tab w:val="right" w:leader="dot" w:pos="9062"/>
+                </w:tabs>
+                <w:rPr>
+                  <w:noProof/>
+                </w:rPr>
+              </w:pPr>
+              <w:hyperlink w:anchor="_Toc230828023" w:history="1">
+                <w:r>
+                  <w:rPr>
+                    <w:rStyle w:val="Lienhypertexte"/>
+                    <w:noProof/>
+                  </w:rPr>
+                  <w:t>Gestionnaire de paquets — Composer</w:t>
+                </w:r>
+                <w:r>
+                  <w:rPr>
+                    <w:noProof/>
+                    <w:webHidden/>
+                  </w:rPr>
+                  <w:tab/>
+                </w:r>
+                <w:r>
+                  <w:rPr>
+                    <w:noProof/>
+                    <w:webHidden/>
+                  </w:rPr>
+                  <w:fldChar w:fldCharType="begin"/>
+                </w:r>
+                <w:r>
+                  <w:rPr>
+                    <w:noProof/>
+                    <w:webHidden/>
+                  </w:rPr>
+                  <w:instrText xml:space="preserve"> PAGEREF _Toc230828023 \h </w:instrText>
+                </w:r>
+                <w:r>
+                  <w:rPr>
+                    <w:noProof/>
+                    <w:webHidden/>
+                  </w:rPr>
+                </w:r>
+                <w:r>
+                  <w:rPr>
+                    <w:noProof/>
+                    <w:webHidden/>
+                  </w:rPr>
+                  <w:fldChar w:fldCharType="separate"/>
+                </w:r>
+                <w:r>
+                  <w:rPr>
+                    <w:noProof/>
+                    <w:webHidden/>
+                  </w:rPr>
+                  <w:t>2</w:t>
+                </w:r>
+                <w:r>
+                  <w:rPr>
+                    <w:noProof/>
+                    <w:webHidden/>
+                  </w:rPr>
+                  <w:fldChar w:fldCharType="end"/>
+                </w:r>
+              </w:hyperlink>
+            </w:p>
+            <w:p>
+              <w:pPr>
+                <w:pStyle w:val="TM2"/>
+                <w:tabs>
+                  <w:tab w:val="right" w:leader="dot" w:pos="9062"/>
+                </w:tabs>
+                <w:rPr>
+                  <w:noProof/>
+                </w:rPr>
+              </w:pPr>
+              <w:hyperlink w:anchor="_Toc230828024" w:history="1">
+                <w:r>
+                  <w:rPr>
+                    <w:rStyle w:val="Lienhypertexte"/>
+                    <w:noProof/>
+                  </w:rPr>
+                  <w:t>Frontend</w:t>
+                </w:r>
+                <w:r>
+                  <w:rPr>
+                    <w:noProof/>
+                    <w:webHidden/>
+                  </w:rPr>
+                  <w:tab/>
+                </w:r>
+                <w:r>
+                  <w:rPr>
+                    <w:noProof/>
+                    <w:webHidden/>
+                  </w:rPr>
+                  <w:fldChar w:fldCharType="begin"/>
+                </w:r>
+                <w:r>
+                  <w:rPr>
+                    <w:noProof/>
+                    <w:webHidden/>
+                  </w:rPr>
+                  <w:instrText xml:space="preserve"> PAGEREF _Toc230828024 \h </w:instrText>
+                </w:r>
+                <w:r>
+                  <w:rPr>
+                    <w:noProof/>
+                    <w:webHidden/>
+                  </w:rPr>
+                </w:r>
+                <w:r>
+                  <w:rPr>
+                    <w:noProof/>
+                    <w:webHidden/>
+                  </w:rPr>
+                  <w:fldChar w:fldCharType="separate"/>
+                </w:r>
+                <w:r>
+                  <w:rPr>
+                    <w:noProof/>
+                    <w:webHidden/>
+                  </w:rPr>
+                  <w:t>2</w:t>
+                </w:r>
+                <w:r>
+                  <w:rPr>
+                    <w:noProof/>
+                    <w:webHidden/>
+                  </w:rPr>
+                  <w:fldChar w:fldCharType="end"/>
+                </w:r>
+              </w:hyperlink>
+            </w:p>
+            <w:p>
+              <w:pPr>
+                <w:pStyle w:val="TM2"/>
+                <w:tabs>
+                  <w:tab w:val="right" w:leader="dot" w:pos="9062"/>
+                </w:tabs>
+                <w:rPr>
+                  <w:noProof/>
+                </w:rPr>
+              </w:pPr>
+              <w:hyperlink w:anchor="_Toc230828025" w:history="1">
+                <w:r>
+                  <w:rPr>
+                    <w:rStyle w:val="Lienhypertexte"/>
+                    <w:noProof/>
+                  </w:rPr>
+                  <w:t>Backend — PHP</w:t>
+                </w:r>
+                <w:r>
+                  <w:rPr>
+                    <w:noProof/>
+                    <w:webHidden/>
+                  </w:rPr>
+                  <w:tab/>
+                </w:r>
+                <w:r>
+                  <w:rPr>
+                    <w:noProof/>
+                    <w:webHidden/>
+                  </w:rPr>
+                  <w:fldChar w:fldCharType="begin"/>
+                </w:r>
+                <w:r>
+                  <w:rPr>
+                    <w:noProof/>
+                    <w:webHidden/>
+                  </w:rPr>
+                  <w:instrText xml:space="preserve"> PAGEREF _Toc230828025 \h </w:instrText>
+                </w:r>
+                <w:r>
+                  <w:rPr>
+                    <w:noProof/>
+                    <w:webHidden/>
+                  </w:rPr>
+                </w:r>
+                <w:r>
+                  <w:rPr>
+                    <w:noProof/>
+                    <w:webHidden/>
+                  </w:rPr>
+                  <w:fldChar w:fldCharType="separate"/>
+                </w:r>
+                <w:r>
+                  <w:rPr>
+                    <w:noProof/>
+                    <w:webHidden/>
+                  </w:rPr>
+                  <w:t>3</w:t>
+                </w:r>
+                <w:r>
+                  <w:rPr>
+                    <w:noProof/>
+                    <w:webHidden/>
+                  </w:rPr>
+                  <w:fldChar w:fldCharType="end"/>
+                </w:r>
+              </w:hyperlink>
+            </w:p>
+            <w:p>
+              <w:pPr>
+                <w:pStyle w:val="TM2"/>
+                <w:tabs>
+                  <w:tab w:val="right" w:leader="dot" w:pos="9062"/>
+                </w:tabs>
+                <w:rPr>
+                  <w:noProof/>
+                </w:rPr>
+              </w:pPr>
+              <w:hyperlink w:anchor="_Toc230828026" w:history="1">
+                <w:r>
+                  <w:rPr>
+                    <w:rStyle w:val="Lienhypertexte"/>
+                    <w:noProof/>
+                  </w:rPr>
+                  <w:t>Base de données — MySQL</w:t>
+                </w:r>
+                <w:r>
+                  <w:rPr>
+                    <w:noProof/>
+                    <w:webHidden/>
+                  </w:rPr>
+                  <w:tab/>
+                </w:r>
+                <w:r>
+                  <w:rPr>
+                    <w:noProof/>
+                    <w:webHidden/>
+                  </w:rPr>
+                  <w:fldChar w:fldCharType="begin"/>
+                </w:r>
+                <w:r>
+                  <w:rPr>
+                    <w:noProof/>
+                    <w:webHidden/>
+                  </w:rPr>
+                  <w:instrText xml:space="preserve"> PAGEREF _Toc230828026 \h </w:instrText>
+                </w:r>
+                <w:r>
+                  <w:rPr>
+                    <w:noProof/>
+                    <w:webHidden/>
+                  </w:rPr>
+                </w:r>
+                <w:r>
+                  <w:rPr>
+                    <w:noProof/>
+                    <w:webHidden/>
+                  </w:rPr>
+                  <w:fldChar w:fldCharType="separate"/>
+                </w:r>
+                <w:r>
+                  <w:rPr>
+                    <w:noProof/>
+                    <w:webHidden/>
+                  </w:rPr>
+                  <w:t>3</w:t>
+                </w:r>
+                <w:r>
+                  <w:rPr>
+                    <w:noProof/>
+                    <w:webHidden/>
+                  </w:rPr>
+                  <w:fldChar w:fldCharType="end"/>
+                </w:r>
+              </w:hyperlink>
+            </w:p>
+            <w:p>
+              <w:pPr>
+                <w:pStyle w:val="TM1"/>
+                <w:tabs>
+                  <w:tab w:val="right" w:leader="dot" w:pos="9062"/>
+                </w:tabs>
+                <w:rPr>
+                  <w:noProof/>
+                </w:rPr>
+              </w:pPr>
+              <w:hyperlink w:anchor="_Toc230828027" w:history="1">
+                <w:r>
+                  <w:rPr>
+                    <w:rStyle w:val="Lienhypertexte"/>
+                    <w:noProof/>
+                  </w:rPr>
+                  <w:t>Diagramme d’entité</w:t>
+                </w:r>
+                <w:r>
+                  <w:rPr>
+                    <w:noProof/>
+                    <w:webHidden/>
+                  </w:rPr>
+                  <w:tab/>
+                </w:r>
+                <w:r>
+                  <w:rPr>
+                    <w:noProof/>
+                    <w:webHidden/>
+                  </w:rPr>
+                  <w:fldChar w:fldCharType="begin"/>
+                </w:r>
+                <w:r>
+                  <w:rPr>
+                    <w:noProof/>
+                    <w:webHidden/>
+                  </w:rPr>
+                  <w:instrText xml:space="preserve"> PAGEREF _Toc230828027 \h </w:instrText>
+                </w:r>
+                <w:r>
+                  <w:rPr>
+                    <w:noProof/>
+                    <w:webHidden/>
+                  </w:rPr>
+                </w:r>
+                <w:r>
+                  <w:rPr>
+                    <w:noProof/>
+                    <w:webHidden/>
+                  </w:rPr>
+                  <w:fldChar w:fldCharType="separate"/>
+                </w:r>
+                <w:r>
+                  <w:rPr>
+                    <w:noProof/>
+                    <w:webHidden/>
+                  </w:rPr>
+                  <w:t>3</w:t>
+                </w:r>
+                <w:r>
+                  <w:rPr>
+                    <w:noProof/>
+                    <w:webHidden/>
+                  </w:rPr>
+                  <w:fldChar w:fldCharType="end"/>
+                </w:r>
+              </w:hyperlink>
+            </w:p>
+            <w:p>
+              <w:pPr>
+                <w:pStyle w:val="TM1"/>
+                <w:tabs>
+                  <w:tab w:val="right" w:leader="dot" w:pos="9062"/>
+                </w:tabs>
+                <w:rPr>
+                  <w:noProof/>
+                </w:rPr>
+              </w:pPr>
+              <w:hyperlink w:anchor="_Toc230828028" w:history="1">
+                <w:r>
+                  <w:rPr>
+                    <w:rStyle w:val="Lienhypertexte"/>
+                    <w:noProof/>
+                  </w:rPr>
+                  <w:t>Diagramme base de données</w:t>
+                </w:r>
+                <w:r>
+                  <w:rPr>
+                    <w:noProof/>
+                    <w:webHidden/>
+                  </w:rPr>
+                  <w:tab/>
+                </w:r>
+                <w:r>
+                  <w:rPr>
+                    <w:noProof/>
+                    <w:webHidden/>
+                  </w:rPr>
+                  <w:fldChar w:fldCharType="begin"/>
+                </w:r>
+                <w:r>
+                  <w:rPr>
+                    <w:noProof/>
+                    <w:webHidden/>
+                  </w:rPr>
+                  <w:instrText xml:space="preserve"> PAGEREF _Toc230828028 \h </w:instrText>
+                </w:r>
+                <w:r>
+                  <w:rPr>
+                    <w:noProof/>
+                    <w:webHidden/>
+                  </w:rPr>
+                </w:r>
+                <w:r>
+                  <w:rPr>
+                    <w:noProof/>
+                    <w:webHidden/>
+                  </w:rPr>
+                  <w:fldChar w:fldCharType="separate"/>
+                </w:r>
+                <w:r>
+                  <w:rPr>
+                    <w:noProof/>
+                    <w:webHidden/>
+                  </w:rPr>
+                  <w:t>4</w:t>
+                </w:r>
+                <w:r>
+                  <w:rPr>
+                    <w:noProof/>
+                    <w:webHidden/>
+                  </w:rPr>
+                  <w:fldChar w:fldCharType="end"/>
+                </w:r>
+              </w:hyperlink>
+            </w:p>
+            <w:p>
+              <w:pPr>
+                <w:pStyle w:val="TM2"/>
+                <w:tabs>
+                  <w:tab w:val="right" w:leader="dot" w:pos="9062"/>
+                </w:tabs>
+                <w:rPr>
+                  <w:noProof/>
+                </w:rPr>
+              </w:pPr>
+              <w:hyperlink w:anchor="_Toc230828029" w:history="1">
+                <w:r>
+                  <w:rPr>
+                    <w:rStyle w:val="Lienhypertexte"/>
+                    <w:noProof/>
+                  </w:rPr>
+                  <w:t>Les tables principales</w:t>
+                </w:r>
+                <w:r>
+                  <w:rPr>
+                    <w:noProof/>
+                    <w:webHidden/>
+                  </w:rPr>
+                  <w:tab/>
+                </w:r>
+                <w:r>
+                  <w:rPr>
+                    <w:noProof/>
+                    <w:webHidden/>
+                  </w:rPr>
+                  <w:fldChar w:fldCharType="begin"/>
+                </w:r>
+                <w:r>
+                  <w:rPr>
+                    <w:noProof/>
+                    <w:webHidden/>
+                  </w:rPr>
+                  <w:instrText xml:space="preserve"> PAGEREF _Toc230828029 \h </w:instrText>
+                </w:r>
+                <w:r>
+                  <w:rPr>
+                    <w:noProof/>
+                    <w:webHidden/>
+                  </w:rPr>
+                </w:r>
+                <w:r>
+                  <w:rPr>
+                    <w:noProof/>
+                    <w:webHidden/>
+                  </w:rPr>
+                  <w:fldChar w:fldCharType="separate"/>
+                </w:r>
+                <w:r>
+                  <w:rPr>
+                    <w:noProof/>
+                    <w:webHidden/>
+                  </w:rPr>
+                  <w:t>4</w:t>
+                </w:r>
+                <w:r>
+                  <w:rPr>
+                    <w:noProof/>
+                    <w:webHidden/>
+                  </w:rPr>
+                  <w:fldChar w:fldCharType="end"/>
+                </w:r>
+              </w:hyperlink>
+            </w:p>
+            <w:p>
+              <w:pPr>
+                <w:pStyle w:val="TM2"/>
+                <w:tabs>
+                  <w:tab w:val="right" w:leader="dot" w:pos="9062"/>
+                </w:tabs>
+                <w:rPr>
+                  <w:noProof/>
+                </w:rPr>
+              </w:pPr>
+              <w:hyperlink w:anchor="_Toc230828030" w:history="1">
+                <w:r>
+                  <w:rPr>
+                    <w:rStyle w:val="Lienhypertexte"/>
+                    <w:noProof/>
+                  </w:rPr>
+                  <w:t>Les tables de jointure</w:t>
+                </w:r>
+                <w:r>
+                  <w:rPr>
+                    <w:noProof/>
+                    <w:webHidden/>
+                  </w:rPr>
+                  <w:tab/>
+                </w:r>
+                <w:r>
+                  <w:rPr>
+                    <w:noProof/>
+                    <w:webHidden/>
+                  </w:rPr>
+                  <w:fldChar w:fldCharType="begin"/>
+                </w:r>
+                <w:r>
+                  <w:rPr>
+                    <w:noProof/>
+                    <w:webHidden/>
+                  </w:rPr>
+                  <w:instrText xml:space="preserve"> PAGEREF _Toc230828030 \h </w:instrText>
+                </w:r>
+                <w:r>
+                  <w:rPr>
+                    <w:noProof/>
+                    <w:webHidden/>
+                  </w:rPr>
+                </w:r>
+                <w:r>
+                  <w:rPr>
+                    <w:noProof/>
+                    <w:webHidden/>
+                  </w:rPr>
+                  <w:fldChar w:fldCharType="separate"/>
+                </w:r>
+                <w:r>
+                  <w:rPr>
+                    <w:noProof/>
+                    <w:webHidden/>
+                  </w:rPr>
+                  <w:t>4</w:t>
+                </w:r>
+                <w:r>
+                  <w:rPr>
+                    <w:noProof/>
+                    <w:webHidden/>
+                  </w:rPr>
+                  <w:fldChar w:fldCharType="end"/>
+                </w:r>
+              </w:hyperlink>
+            </w:p>
+            <w:p>
+              <w:pPr>
+                <w:pStyle w:val="TM3"/>
+                <w:tabs>
+                  <w:tab w:val="right" w:leader="dot" w:pos="9062"/>
+                </w:tabs>
+                <w:rPr>
+                  <w:noProof/>
+                </w:rPr>
+              </w:pPr>
+              <w:hyperlink w:anchor="_Toc230828031" w:history="1">
+                <w:r>
+                  <w:rPr>
+                    <w:rStyle w:val="Lienhypertexte"/>
+                    <w:rFonts w:ascii="Cascadia Code" w:eastAsia="Yu Gothic UI Semibold" w:hAnsi="Cascadia Code" w:cs="Cascadia Code"/>
+                    <w:i/>
+                    <w:iCs/>
+                    <w:noProof/>
+                  </w:rPr>
+                  <w:t>fonction_tech</w:t>
+                </w:r>
+                <w:r>
+                  <w:rPr>
+                    <w:rStyle w:val="Lienhypertexte"/>
+                    <w:noProof/>
+                  </w:rPr>
+                  <w:t xml:space="preserve"> — la gestion des profils</w:t>
+                </w:r>
+                <w:r>
+                  <w:rPr>
+                    <w:noProof/>
+                    <w:webHidden/>
+                  </w:rPr>
+                  <w:tab/>
+                </w:r>
+                <w:r>
+                  <w:rPr>
+                    <w:noProof/>
+                    <w:webHidden/>
+                  </w:rPr>
+                  <w:fldChar w:fldCharType="begin"/>
+                </w:r>
+                <w:r>
+                  <w:rPr>
+                    <w:noProof/>
+                    <w:webHidden/>
+                  </w:rPr>
+                  <w:instrText xml:space="preserve"> PAGEREF _Toc230828031 \h </w:instrText>
+                </w:r>
+                <w:r>
+                  <w:rPr>
+                    <w:noProof/>
+                    <w:webHidden/>
+                  </w:rPr>
+                </w:r>
+                <w:r>
+                  <w:rPr>
+                    <w:noProof/>
+                    <w:webHidden/>
+                  </w:rPr>
+                  <w:fldChar w:fldCharType="separate"/>
+                </w:r>
+                <w:r>
+                  <w:rPr>
+                    <w:noProof/>
+                    <w:webHidden/>
+                  </w:rPr>
+                  <w:t>4</w:t>
+                </w:r>
+                <w:r>
+                  <w:rPr>
+                    <w:noProof/>
+                    <w:webHidden/>
+                  </w:rPr>
+                  <w:fldChar w:fldCharType="end"/>
+                </w:r>
+              </w:hyperlink>
+            </w:p>
+            <w:p>
+              <w:pPr>
+                <w:pStyle w:val="TM3"/>
+                <w:tabs>
+                  <w:tab w:val="right" w:leader="dot" w:pos="9062"/>
+                </w:tabs>
+                <w:rPr>
+                  <w:noProof/>
+                </w:rPr>
+              </w:pPr>
+              <w:hyperlink w:anchor="_Toc230828032" w:history="1">
+                <w:r>
+                  <w:rPr>
+                    <w:rStyle w:val="Lienhypertexte"/>
+                    <w:rFonts w:ascii="Cascadia Code" w:eastAsia="Yu Gothic UI Semibold" w:hAnsi="Cascadia Code" w:cs="Cascadia Code"/>
+                    <w:i/>
+                    <w:iCs/>
+                    <w:noProof/>
+                  </w:rPr>
+                  <w:t>tech_jobs</w:t>
+                </w:r>
+                <w:r>
+                  <w:rPr>
+                    <w:rStyle w:val="Lienhypertexte"/>
+                    <w:noProof/>
+                  </w:rPr>
+                  <w:t xml:space="preserve"> — la gestion des affectations</w:t>
+                </w:r>
+                <w:r>
+                  <w:rPr>
+                    <w:noProof/>
+                    <w:webHidden/>
+                  </w:rPr>
+                  <w:tab/>
+                </w:r>
+                <w:r>
+                  <w:rPr>
+                    <w:noProof/>
+                    <w:webHidden/>
+                  </w:rPr>
+                  <w:fldChar w:fldCharType="begin"/>
+                </w:r>
+                <w:r>
+                  <w:rPr>
+                    <w:noProof/>
+                    <w:webHidden/>
+                  </w:rPr>
+                  <w:instrText xml:space="preserve"> PAGEREF _Toc230828032 \h </w:instrText>
+                </w:r>
+                <w:r>
+                  <w:rPr>
+                    <w:noProof/>
+                    <w:webHidden/>
+                  </w:rPr>
+                </w:r>
+                <w:r>
+                  <w:rPr>
+                    <w:noProof/>
+                    <w:webHidden/>
+                  </w:rPr>
+                  <w:fldChar w:fldCharType="separate"/>
+                </w:r>
+                <w:r>
+                  <w:rPr>
+                    <w:noProof/>
+                    <w:webHidden/>
+                  </w:rPr>
+                  <w:t>4</w:t>
+                </w:r>
+                <w:r>
+                  <w:rPr>
+                    <w:noProof/>
+                    <w:webHidden/>
+                  </w:rPr>
+                  <w:fldChar w:fldCharType="end"/>
+                </w:r>
+              </w:hyperlink>
+            </w:p>
+            <w:p>
+              <w:pPr>
+                <w:pStyle w:val="TM1"/>
+                <w:tabs>
+                  <w:tab w:val="right" w:leader="dot" w:pos="9062"/>
+                </w:tabs>
+                <w:rPr>
+                  <w:noProof/>
+                </w:rPr>
+              </w:pPr>
+              <w:hyperlink w:anchor="_Toc230828033" w:history="1">
+                <w:r>
+                  <w:rPr>
+                    <w:rStyle w:val="Lienhypertexte"/>
+                    <w:noProof/>
+                  </w:rPr>
+                  <w:t>Procédure de déploiement</w:t>
+                </w:r>
+                <w:r>
+                  <w:rPr>
+                    <w:noProof/>
+                    <w:webHidden/>
+                  </w:rPr>
+                  <w:tab/>
+                </w:r>
+                <w:r>
+                  <w:rPr>
+                    <w:noProof/>
+                    <w:webHidden/>
+                  </w:rPr>
+                  <w:fldChar w:fldCharType="begin"/>
+                </w:r>
+                <w:r>
+                  <w:rPr>
+                    <w:noProof/>
+                    <w:webHidden/>
+                  </w:rPr>
+                  <w:instrText xml:space="preserve"> PAGEREF _Toc230828033 \h </w:instrText>
+                </w:r>
+                <w:r>
+                  <w:rPr>
+                    <w:noProof/>
+                    <w:webHidden/>
+                  </w:rPr>
+                </w:r>
+                <w:r>
+                  <w:rPr>
+                    <w:noProof/>
+                    <w:webHidden/>
+                  </w:rPr>
+                  <w:fldChar w:fldCharType="separate"/>
+                </w:r>
+                <w:r>
+                  <w:rPr>
+                    <w:noProof/>
+                    <w:webHidden/>
+                  </w:rPr>
+                  <w:t>5</w:t>
+                </w:r>
+                <w:r>
+                  <w:rPr>
+                    <w:noProof/>
+                    <w:webHidden/>
+                  </w:rPr>
+                  <w:fldChar w:fldCharType="end"/>
+                </w:r>
+              </w:hyperlink>
+            </w:p>
+            <w:p>
+              <w:pPr>
+                <w:pStyle w:val="TM1"/>
+                <w:tabs>
+                  <w:tab w:val="right" w:leader="dot" w:pos="9062"/>
+                </w:tabs>
+                <w:rPr>
+                  <w:noProof/>
+                </w:rPr>
+              </w:pPr>
+              <w:hyperlink w:anchor="_Toc230828034" w:history="1">
+                <w:r>
+                  <w:rPr>
+                    <w:rStyle w:val="Lienhypertexte"/>
+                    <w:noProof/>
+                  </w:rPr>
+                  <w:t>Mode d’emploi utilisateur sommaire</w:t>
+                </w:r>
+                <w:r>
+                  <w:rPr>
+                    <w:noProof/>
+                    <w:webHidden/>
+                  </w:rPr>
+                  <w:tab/>
+                </w:r>
+                <w:r>
+                  <w:rPr>
+                    <w:noProof/>
+                    <w:webHidden/>
+                  </w:rPr>
+                  <w:fldChar w:fldCharType="begin"/>
+                </w:r>
+                <w:r>
+                  <w:rPr>
+                    <w:noProof/>
+                    <w:webHidden/>
+                  </w:rPr>
+                  <w:instrText xml:space="preserve"> PAGEREF _Toc230828034 \h </w:instrText>
+                </w:r>
+                <w:r>
+                  <w:rPr>
+                    <w:noProof/>
+                    <w:webHidden/>
+                  </w:rPr>
+                </w:r>
+                <w:r>
+                  <w:rPr>
+                    <w:noProof/>
+                    <w:webHidden/>
+                  </w:rPr>
+                  <w:fldChar w:fldCharType="separate"/>
+                </w:r>
+                <w:r>
+                  <w:rPr>
+                    <w:noProof/>
+                    <w:webHidden/>
+                  </w:rPr>
+                  <w:t>5</w:t>
+                </w:r>
+                <w:r>
+                  <w:rPr>
+                    <w:noProof/>
+                    <w:webHidden/>
+                  </w:rPr>
+                  <w:fldChar w:fldCharType="end"/>
+                </w:r>
+              </w:hyperlink>
+            </w:p>
+            <w:p>
+              <w:pPr>
+                <w:pStyle w:val="TM1"/>
+                <w:tabs>
+                  <w:tab w:val="right" w:leader="dot" w:pos="9062"/>
+                </w:tabs>
+                <w:rPr>
+                  <w:noProof/>
+                </w:rPr>
+              </w:pPr>
+              <w:hyperlink w:anchor="_Toc230828035" w:history="1">
+                <w:r>
+                  <w:rPr>
+                    <w:rStyle w:val="Lienhypertexte"/>
+                    <w:noProof/>
+                  </w:rPr>
+                  <w:t>Descriptions des relations DB et Classes</w:t>
+                </w:r>
+                <w:r>
+                  <w:rPr>
+                    <w:noProof/>
+                    <w:webHidden/>
+                  </w:rPr>
+                  <w:tab/>
+                </w:r>
+                <w:r>
+                  <w:rPr>
+                    <w:noProof/>
+                    <w:webHidden/>
+                  </w:rPr>
+                  <w:fldChar w:fldCharType="begin"/>
+                </w:r>
+                <w:r>
+                  <w:rPr>
+                    <w:noProof/>
+                    <w:webHidden/>
+                  </w:rPr>
+                  <w:instrText xml:space="preserve"> PAGEREF _Toc230828035 \h </w:instrText>
+                </w:r>
+                <w:r>
+                  <w:rPr>
+                    <w:noProof/>
+                    <w:webHidden/>
+                  </w:rPr>
+                </w:r>
+                <w:r>
+                  <w:rPr>
+                    <w:noProof/>
+                    <w:webHidden/>
+                  </w:rPr>
+                  <w:fldChar w:fldCharType="separate"/>
+                </w:r>
+                <w:r>
+                  <w:rPr>
+                    <w:noProof/>
+                    <w:webHidden/>
+                  </w:rPr>
+                  <w:t>5</w:t>
+                </w:r>
+                <w:r>
+                  <w:rPr>
+                    <w:noProof/>
+                    <w:webHidden/>
+                  </w:rPr>
+                  <w:fldChar w:fldCharType="end"/>
+                </w:r>
+              </w:hyperlink>
+            </w:p>
+            <w:p>
+              <w:pPr>
+                <w:pStyle w:val="TM1"/>
+                <w:tabs>
+                  <w:tab w:val="right" w:leader="dot" w:pos="9062"/>
+                </w:tabs>
+                <w:rPr>
+                  <w:noProof/>
+                </w:rPr>
+              </w:pPr>
+              <w:hyperlink w:anchor="_Toc230828036" w:history="1">
+                <w:r>
+                  <w:rPr>
+                    <w:rStyle w:val="Lienhypertexte"/>
+                    <w:noProof/>
+                  </w:rPr>
+                  <w:t>Annexe</w:t>
+                </w:r>
+                <w:r>
+                  <w:rPr>
+                    <w:noProof/>
+                    <w:webHidden/>
+                  </w:rPr>
+                  <w:tab/>
+                </w:r>
+                <w:r>
+                  <w:rPr>
+                    <w:noProof/>
+                    <w:webHidden/>
+                  </w:rPr>
+                  <w:fldChar w:fldCharType="begin"/>
+                </w:r>
+                <w:r>
+                  <w:rPr>
+                    <w:noProof/>
+                    <w:webHidden/>
+                  </w:rPr>
+                  <w:instrText xml:space="preserve"> PAGEREF _Toc230828036 \h </w:instrText>
+                </w:r>
+                <w:r>
+                  <w:rPr>
+                    <w:noProof/>
+                    <w:webHidden/>
+                  </w:rPr>
+                </w:r>
+                <w:r>
+                  <w:rPr>
+                    <w:noProof/>
+                    <w:webHidden/>
+                  </w:rPr>
+                  <w:fldChar w:fldCharType="separate"/>
+                </w:r>
+                <w:r>
+                  <w:rPr>
+                    <w:noProof/>
+                    <w:webHidden/>
+                  </w:rPr>
+                  <w:t>5</w:t>
+                </w:r>
+                <w:r>
+                  <w:rPr>
+                    <w:noProof/>
+                    <w:webHidden/>
+                  </w:rPr>
+                  <w:fldChar w:fldCharType="end"/>
+                </w:r>
+              </w:hyperlink>
+            </w:p>
+            <w:p>
+              <w:pPr>
+                <w:pStyle w:val="TM2"/>
+                <w:tabs>
+                  <w:tab w:val="right" w:leader="dot" w:pos="9062"/>
+                </w:tabs>
+                <w:rPr>
+                  <w:noProof/>
+                </w:rPr>
+              </w:pPr>
+              <w:hyperlink w:anchor="_Toc230828037" w:history="1">
+                <w:r>
+                  <w:rPr>
+                    <w:rStyle w:val="Lienhypertexte"/>
+                    <w:noProof/>
+                  </w:rPr>
+                  <w:t>Diagramme entité</w:t>
+                </w:r>
+                <w:r>
+                  <w:rPr>
+                    <w:noProof/>
+                    <w:webHidden/>
+                  </w:rPr>
+                  <w:tab/>
+                </w:r>
+                <w:r>
+                  <w:rPr>
+                    <w:noProof/>
+                    <w:webHidden/>
+                  </w:rPr>
+                  <w:fldChar w:fldCharType="begin"/>
+                </w:r>
+                <w:r>
+                  <w:rPr>
+                    <w:noProof/>
+                    <w:webHidden/>
+                  </w:rPr>
+                  <w:instrText xml:space="preserve"> PAGEREF _Toc230828037 \h </w:instrText>
+                </w:r>
+                <w:r>
+                  <w:rPr>
+                    <w:noProof/>
+                    <w:webHidden/>
+                  </w:rPr>
+                </w:r>
+                <w:r>
+                  <w:rPr>
+                    <w:noProof/>
+                    <w:webHidden/>
+                  </w:rPr>
+                  <w:fldChar w:fldCharType="separate"/>
+                </w:r>
+                <w:r>
+                  <w:rPr>
+                    <w:noProof/>
+                    <w:webHidden/>
+                  </w:rPr>
+                  <w:t>5</w:t>
+                </w:r>
+                <w:r>
+                  <w:rPr>
+                    <w:noProof/>
+                    <w:webHidden/>
+                  </w:rPr>
+                  <w:fldChar w:fldCharType="end"/>
+                </w:r>
+              </w:hyperlink>
+            </w:p>
+            <w:p>
+              <w:pPr>
+                <w:pStyle w:val="TM2"/>
+                <w:tabs>
+                  <w:tab w:val="right" w:leader="dot" w:pos="9062"/>
+                </w:tabs>
+                <w:rPr>
+                  <w:noProof/>
+                </w:rPr>
+              </w:pPr>
+              <w:hyperlink w:anchor="_Toc230828038" w:history="1">
+                <w:r>
+                  <w:rPr>
+                    <w:rStyle w:val="Lienhypertexte"/>
+                    <w:noProof/>
+                  </w:rPr>
+                  <w:t>Diagramme DB</w:t>
+                </w:r>
+                <w:r>
+                  <w:rPr>
+                    <w:noProof/>
+                    <w:webHidden/>
+                  </w:rPr>
+                  <w:tab/>
+                </w:r>
+                <w:r>
+                  <w:rPr>
+                    <w:noProof/>
+                    <w:webHidden/>
+                  </w:rPr>
+                  <w:fldChar w:fldCharType="begin"/>
+                </w:r>
+                <w:r>
+                  <w:rPr>
+                    <w:noProof/>
+                    <w:webHidden/>
+                  </w:rPr>
+                  <w:instrText xml:space="preserve"> PAGEREF _Toc230828038 \h </w:instrText>
+                </w:r>
+                <w:r>
+                  <w:rPr>
+                    <w:noProof/>
+                    <w:webHidden/>
+                  </w:rPr>
+                </w:r>
+                <w:r>
+                  <w:rPr>
+                    <w:noProof/>
+                    <w:webHidden/>
+                  </w:rPr>
+                  <w:fldChar w:fldCharType="separate"/>
+                </w:r>
+                <w:r>
+                  <w:rPr>
+                    <w:noProof/>
+                    <w:webHidden/>
+                  </w:rPr>
+                  <w:t>6</w:t>
+                </w:r>
+                <w:r>
+                  <w:rPr>
+                    <w:noProof/>
+                    <w:webHidden/>
+                  </w:rPr>
+                  <w:fldChar w:fldCharType="end"/>
+                </w:r>
+              </w:hyperlink>
+            </w:p>
+            <w:p>
+              <w:r>
+                <w:rPr>
+                  <w:b/>
+                  <w:bCs/>
+                </w:rPr>
+                <w:fldChar w:fldCharType="end"/>
+              </w:r>
+            </w:p>
+          </w:sdtContent>
+        </w:sdt>
+        <w:p>
+          <w:pPr>
+            <w:rPr>
+              <w:noProof/>
+            </w:rPr>
+          </w:pPr>
+          <w:r>
+            <w:rPr>
+              <w:noProof/>
+            </w:rPr>
+            <w:br w:type="page"/>
+          </w:r>
+        </w:p>
+        <w:p>
+          <w:pPr>
+            <w:rPr>
+              <w:noProof/>
+            </w:rPr>
+          </w:pPr>
+        </w:p>
       </w:sdtContent>
     </w:sdt>
     <w:p>
@@ -4123,6 +5439,7 @@
           <w:color w:val="0F4761" w:themeColor="accent1" w:themeShade="BF"/>
         </w:rPr>
       </w:pPr>
+      <w:bookmarkStart w:id="0" w:name="_Toc230828021"/>
       <w:r>
         <w:rPr>
           <w:rStyle w:val="Accentuationlgre"/>
@@ -4130,9 +5447,9 @@
           <w:iCs w:val="0"/>
           <w:color w:val="0F4761" w:themeColor="accent1" w:themeShade="BF"/>
         </w:rPr>
-        <w:lastRenderedPageBreak/>
         <w:t>Explication sommaire</w:t>
       </w:r>
+      <w:bookmarkEnd w:id="0"/>
     </w:p>
     <w:p>
       <w:r>
@@ -4233,23 +5550,7 @@
         <w:t>Fonctions</w:t>
       </w:r>
       <w:r>
-        <w:t xml:space="preserve"> – Gestion des fonctions (</w:t>
-      </w:r>
-      <w:proofErr w:type="spellStart"/>
-      <w:r>
-        <w:t>Create</w:t>
-      </w:r>
-      <w:proofErr w:type="spellEnd"/>
-      <w:r>
-        <w:t xml:space="preserve">, Read, Update &amp; </w:t>
-      </w:r>
-      <w:proofErr w:type="spellStart"/>
-      <w:r>
-        <w:t>Delete</w:t>
-      </w:r>
-      <w:proofErr w:type="spellEnd"/>
-      <w:r>
-        <w:t xml:space="preserve"> si aucune liaison).</w:t>
+        <w:t xml:space="preserve"> – Gestion des fonctions (Create, Read, Update &amp; Delete si aucune liaison).</w:t>
       </w:r>
     </w:p>
     <w:p>
@@ -4267,15 +5568,7 @@
         <w:t>Techniciens</w:t>
       </w:r>
       <w:r>
-        <w:t xml:space="preserve"> – Gestion des techniciens (</w:t>
-      </w:r>
-      <w:proofErr w:type="spellStart"/>
-      <w:r>
-        <w:t>Create</w:t>
-      </w:r>
-      <w:proofErr w:type="spellEnd"/>
-      <w:r>
-        <w:t>, Read, Update) avec l’affectation des fonctions relatives.</w:t>
+        <w:t xml:space="preserve"> – Gestion des techniciens (Create, Read, Update) avec l’affectation des fonctions relatives.</w:t>
       </w:r>
     </w:p>
     <w:p>
@@ -4293,23 +5586,7 @@
         <w:t>Projets</w:t>
       </w:r>
       <w:r>
-        <w:t xml:space="preserve"> – Gestion des projets (</w:t>
-      </w:r>
-      <w:proofErr w:type="spellStart"/>
-      <w:r>
-        <w:t>Create</w:t>
-      </w:r>
-      <w:proofErr w:type="spellEnd"/>
-      <w:r>
-        <w:t xml:space="preserve">, Read, Update et </w:t>
-      </w:r>
-      <w:proofErr w:type="spellStart"/>
-      <w:r>
-        <w:t>Delete</w:t>
-      </w:r>
-      <w:proofErr w:type="spellEnd"/>
-      <w:r>
-        <w:t xml:space="preserve"> si aucune liaison).</w:t>
+        <w:t xml:space="preserve"> – Gestion des projets (Create, Read, Update et Delete si aucune liaison).</w:t>
       </w:r>
     </w:p>
     <w:p>
@@ -4327,15 +5604,7 @@
         <w:t>Tickets</w:t>
       </w:r>
       <w:r>
-        <w:t xml:space="preserve"> – Gestion des tickets (Création, Lecture, Update et </w:t>
-      </w:r>
-      <w:proofErr w:type="spellStart"/>
-      <w:r>
-        <w:t>Delete</w:t>
-      </w:r>
-      <w:proofErr w:type="spellEnd"/>
-      <w:r>
-        <w:t xml:space="preserve"> si aucune liaison) et affectation du ticket au technicien.</w:t>
+        <w:t xml:space="preserve"> – Gestion des tickets (Création, Lecture, Update et Delete si aucune liaison) et affectation du ticket au technicien.</w:t>
       </w:r>
     </w:p>
     <w:p>
@@ -4361,33 +5630,647 @@
       <w:pPr>
         <w:pStyle w:val="Titre1"/>
       </w:pPr>
-      <w:r>
-        <w:lastRenderedPageBreak/>
+      <w:bookmarkStart w:id="1" w:name="_Toc230828022"/>
+      <w:r>
         <w:t>Choix stack</w:t>
       </w:r>
+      <w:bookmarkEnd w:id="1"/>
     </w:p>
     <w:p>
       <w:pPr>
-        <w:pStyle w:val="Titre1"/>
-      </w:pPr>
-      <w:r>
-        <w:t xml:space="preserve">Diagramme de classe </w:t>
-      </w:r>
+        <w:pStyle w:val="Titre2"/>
+      </w:pPr>
+      <w:bookmarkStart w:id="2" w:name="_Toc230828023"/>
+      <w:r>
+        <w:t>Gestionnaire de paquets — Composer</w:t>
+      </w:r>
+      <w:bookmarkEnd w:id="2"/>
     </w:p>
     <w:p>
       <w:pPr>
-        <w:pStyle w:val="Titre1"/>
-      </w:pPr>
-      <w:r>
-        <w:t xml:space="preserve">Diagramme objet </w:t>
+        <w:pStyle w:val="Paragraphedeliste"/>
+        <w:numPr>
+          <w:ilvl w:val="0"/>
+          <w:numId w:val="16"/>
+        </w:numPr>
+      </w:pPr>
+      <w:r>
+        <w:t>Composer est le gestionnaire de paquets de référence dans l'écosystème PHP. Il a permis d'intégrer facilement des bibliothèques tierces au projet, notamment un routeur via PSR-4 pour gérer proprement les URLs de l'application, ainsi que le moteur de templates Twig via le composant Symphony dédié.</w:t>
       </w:r>
     </w:p>
     <w:p>
       <w:pPr>
+        <w:pStyle w:val="Titre2"/>
+      </w:pPr>
+      <w:bookmarkStart w:id="3" w:name="_Toc230828024"/>
+      <w:r>
+        <w:t>Frontend</w:t>
+      </w:r>
+      <w:bookmarkEnd w:id="3"/>
+    </w:p>
+    <w:p>
+      <w:pPr>
+        <w:pStyle w:val="Paragraphedeliste"/>
+        <w:numPr>
+          <w:ilvl w:val="0"/>
+          <w:numId w:val="15"/>
+        </w:numPr>
+      </w:pPr>
+      <w:r>
+        <w:rPr>
+          <w:i/>
+          <w:iCs/>
+          <w:highlight w:val="cyan"/>
+        </w:rPr>
+        <w:t>Twig</w:t>
+      </w:r>
+      <w:r>
+        <w:t xml:space="preserve"> est le moteur de rendu qui se charge de générer les pages HTML côté serveur. Son principal atout sécuritaire est l'échappement automatique des variables, ce qui protège nativement l'application contre les attaques de type XSS (Cross-Site Scripting) et les injections de code PHP non désirées.</w:t>
+      </w:r>
+    </w:p>
+    <w:p>
+      <w:pPr>
+        <w:pStyle w:val="Paragraphedeliste"/>
+        <w:numPr>
+          <w:ilvl w:val="0"/>
+          <w:numId w:val="15"/>
+        </w:numPr>
+      </w:pPr>
+      <w:r>
+        <w:rPr>
+          <w:i/>
+          <w:iCs/>
+          <w:highlight w:val="cyan"/>
+        </w:rPr>
+        <w:lastRenderedPageBreak/>
+        <w:t>JavaScri</w:t>
+      </w:r>
+      <w:r>
+        <w:rPr>
+          <w:i/>
+          <w:iCs/>
+          <w:highlight w:val="cyan"/>
+        </w:rPr>
+        <w:t>pt</w:t>
+      </w:r>
+      <w:r>
+        <w:t xml:space="preserve"> a été intégré tel que défini par le cahier des charges. Il prend en charge les interactions dynamiques côté client.</w:t>
+      </w:r>
+    </w:p>
+    <w:p>
+      <w:pPr>
+        <w:pStyle w:val="Paragraphedeliste"/>
+        <w:numPr>
+          <w:ilvl w:val="0"/>
+          <w:numId w:val="15"/>
+        </w:numPr>
+      </w:pPr>
+      <w:r>
+        <w:rPr>
+          <w:i/>
+          <w:iCs/>
+          <w:highlight w:val="cyan"/>
+        </w:rPr>
+        <w:t>Bootstrap</w:t>
+      </w:r>
+      <w:r>
+        <w:t xml:space="preserve"> est la bibliothèque CSS choisie pour la mise en page. Elle offre une base solide et éprouvée pour produire une interface responsive sans partir de zéro, tout en garantissant une cohérence visuelle sur l'ensemble des écrans.</w:t>
+      </w:r>
+    </w:p>
+    <w:p>
+      <w:pPr>
+        <w:pStyle w:val="Titre2"/>
+      </w:pPr>
+      <w:bookmarkStart w:id="4" w:name="_Toc230828025"/>
+      <w:r>
+        <w:t>Backend</w:t>
+      </w:r>
+      <w:r>
+        <w:t xml:space="preserve"> — PHP</w:t>
+      </w:r>
+      <w:bookmarkEnd w:id="4"/>
+    </w:p>
+    <w:p>
+      <w:pPr>
+        <w:pStyle w:val="Paragraphedeliste"/>
+        <w:numPr>
+          <w:ilvl w:val="0"/>
+          <w:numId w:val="15"/>
+        </w:numPr>
+      </w:pPr>
+      <w:r>
+        <w:rPr>
+          <w:highlight w:val="cyan"/>
+        </w:rPr>
+        <w:t>PHP</w:t>
+      </w:r>
+      <w:r>
+        <w:t xml:space="preserve"> constitue le socle du </w:t>
+      </w:r>
+      <w:r>
+        <w:t>backend</w:t>
+      </w:r>
+      <w:r>
+        <w:t>, conformément aux exigences du projet. Il gère la logique métier, le traitement des formulaires et les échanges avec la base de données.</w:t>
+      </w:r>
+    </w:p>
+    <w:p>
+      <w:pPr>
+        <w:pStyle w:val="Titre2"/>
+      </w:pPr>
+      <w:bookmarkStart w:id="5" w:name="_Toc230828026"/>
+      <w:r>
+        <w:t>Base de données — MySQL</w:t>
+      </w:r>
+      <w:bookmarkEnd w:id="5"/>
+    </w:p>
+    <w:p>
+      <w:pPr>
+        <w:pStyle w:val="Paragraphedeliste"/>
+        <w:numPr>
+          <w:ilvl w:val="0"/>
+          <w:numId w:val="15"/>
+        </w:numPr>
+      </w:pPr>
+      <w:r>
+        <w:rPr>
+          <w:highlight w:val="cyan"/>
+        </w:rPr>
+        <w:t>MySQL</w:t>
+      </w:r>
+      <w:r>
+        <w:t xml:space="preserve"> a été retenu comme système de gestion de base de données relationnelle, également imposé par le cadre du projet. Il assure le stockage, la structuration et l'interrogation de l'ensemble des données de l'application.</w:t>
+      </w:r>
+    </w:p>
+    <w:p/>
+    <w:p>
+      <w:pPr>
         <w:pStyle w:val="Titre1"/>
       </w:pPr>
-      <w:r>
+      <w:bookmarkStart w:id="6" w:name="_Toc230828027"/>
+      <w:r>
+        <w:t>Diagramme d</w:t>
+      </w:r>
+      <w:r>
+        <w:t>’entité</w:t>
+      </w:r>
+      <w:bookmarkEnd w:id="6"/>
+    </w:p>
+    <w:p>
+      <w:r>
+        <w:rPr>
+          <w:b/>
+          <w:bCs/>
+        </w:rPr>
+        <w:t>Modélisation orientée objet</w:t>
+      </w:r>
+    </w:p>
+    <w:p>
+      <w:r>
+        <w:t>Le modèle objet de l'application repose sur cinq entités distinctes, chacune encapsulant un périmètre fonctionnel précis et communiquant avec les autres au travers de relations typées.</w:t>
+      </w:r>
+    </w:p>
+    <w:p>
+      <w:proofErr w:type="spellStart"/>
+      <w:r>
+        <w:rPr>
+          <w:rFonts w:ascii="Cascadia Code" w:eastAsia="Yu Gothic UI Semibold" w:hAnsi="Cascadia Code" w:cs="Cascadia Code"/>
+          <w:i/>
+          <w:iCs/>
+          <w:color w:val="FFFF00"/>
+          <w:highlight w:val="black"/>
+        </w:rPr>
+        <w:t>UserEntity</w:t>
+      </w:r>
+      <w:proofErr w:type="spellEnd"/>
+      <w:r>
+        <w:t xml:space="preserve"> constitue une entité autonome dédiée exclusivement à la gestion des accès. Elle ne participe à aucune relation avec les autres entités du modèle.</w:t>
+      </w:r>
+    </w:p>
+    <w:p>
+      <w:proofErr w:type="spellStart"/>
+      <w:r>
+        <w:rPr>
+          <w:rFonts w:ascii="Cascadia Code" w:eastAsia="Yu Gothic UI Semibold" w:hAnsi="Cascadia Code" w:cs="Cascadia Code"/>
+          <w:i/>
+          <w:iCs/>
+          <w:color w:val="FFFF00"/>
+          <w:highlight w:val="black"/>
+        </w:rPr>
+        <w:t>TechEntity</w:t>
+      </w:r>
+      <w:proofErr w:type="spellEnd"/>
+      <w:r>
+        <w:t xml:space="preserve"> et </w:t>
+      </w:r>
+      <w:proofErr w:type="spellStart"/>
+      <w:r>
+        <w:rPr>
+          <w:rFonts w:ascii="Cascadia Code" w:eastAsia="Yu Gothic UI Semibold" w:hAnsi="Cascadia Code" w:cs="Cascadia Code"/>
+          <w:i/>
+          <w:iCs/>
+          <w:color w:val="FFFF00"/>
+          <w:highlight w:val="black"/>
+        </w:rPr>
+        <w:t>FonctionEntity</w:t>
+      </w:r>
+      <w:proofErr w:type="spellEnd"/>
+      <w:r>
+        <w:t xml:space="preserve"> entretiennent une relation bidirectionnelle de type plusieurs-à-plusieurs. Un agent peut cumuler plusieurs qualifications, et une qualification peut être partagée par plusieurs agents. Chaque entité porte la référence de l'autre sous forme de collection.</w:t>
+      </w:r>
+    </w:p>
+    <w:p>
+      <w:proofErr w:type="spellStart"/>
+      <w:r>
+        <w:rPr>
+          <w:rFonts w:ascii="Cascadia Code" w:eastAsia="Yu Gothic UI Semibold" w:hAnsi="Cascadia Code" w:cs="Cascadia Code"/>
+          <w:i/>
+          <w:iCs/>
+          <w:color w:val="FFFF00"/>
+          <w:highlight w:val="black"/>
+        </w:rPr>
+        <w:t>ProjectEntity</w:t>
+      </w:r>
+      <w:proofErr w:type="spellEnd"/>
+      <w:r>
+        <w:t xml:space="preserve"> et </w:t>
+      </w:r>
+      <w:proofErr w:type="spellStart"/>
+      <w:r>
+        <w:rPr>
+          <w:rFonts w:ascii="Cascadia Code" w:eastAsia="Yu Gothic UI Semibold" w:hAnsi="Cascadia Code" w:cs="Cascadia Code"/>
+          <w:i/>
+          <w:iCs/>
+          <w:color w:val="FFFF00"/>
+          <w:highlight w:val="black"/>
+        </w:rPr>
+        <w:t>JobEntity</w:t>
+      </w:r>
+      <w:proofErr w:type="spellEnd"/>
+      <w:r>
+        <w:t xml:space="preserve"> sont liées par une relation hiérarchique de type un-à-plusieurs. Un projet agrège un ensemble de tickets, et chaque ticket est obligatoirement rattaché à un projet parent via une clé de référence.</w:t>
+      </w:r>
+    </w:p>
+    <w:p>
+      <w:r>
+        <w:t xml:space="preserve">Enfin, </w:t>
+      </w:r>
+      <w:proofErr w:type="spellStart"/>
+      <w:r>
+        <w:rPr>
+          <w:rFonts w:ascii="Cascadia Code" w:eastAsia="Yu Gothic UI Semibold" w:hAnsi="Cascadia Code" w:cs="Cascadia Code"/>
+          <w:i/>
+          <w:iCs/>
+          <w:color w:val="FFFF00"/>
+          <w:highlight w:val="black"/>
+        </w:rPr>
+        <w:t>JobEntity</w:t>
+      </w:r>
+      <w:proofErr w:type="spellEnd"/>
+      <w:r>
+        <w:t xml:space="preserve"> et </w:t>
+      </w:r>
+      <w:proofErr w:type="spellStart"/>
+      <w:r>
+        <w:rPr>
+          <w:rFonts w:ascii="Cascadia Code" w:eastAsia="Yu Gothic UI Semibold" w:hAnsi="Cascadia Code" w:cs="Cascadia Code"/>
+          <w:i/>
+          <w:iCs/>
+          <w:color w:val="FFFF00"/>
+          <w:highlight w:val="black"/>
+        </w:rPr>
+        <w:t>TechEntity</w:t>
+      </w:r>
+      <w:proofErr w:type="spellEnd"/>
+      <w:r>
+        <w:t xml:space="preserve"> entretiennent également une relation plusieurs-à-plusieurs. Un ticket peut mobiliser plusieurs agents simultanément, et un agent peut être affecté à plusieurs tickets au cours d'une même période.</w:t>
+      </w:r>
+    </w:p>
+    <w:p>
+      <w:pPr>
+        <w:pStyle w:val="Citation"/>
+      </w:pPr>
+      <w:r>
+        <w:t>Voir annexe « Diagramme entité » pour plus d’information</w:t>
+      </w:r>
+    </w:p>
+    <w:p>
+      <w:pPr>
+        <w:pStyle w:val="Titre1"/>
+      </w:pPr>
+      <w:bookmarkStart w:id="7" w:name="_Toc230828028"/>
+      <w:r>
+        <w:lastRenderedPageBreak/>
         <w:t>Diagramme base de données</w:t>
+      </w:r>
+      <w:bookmarkEnd w:id="7"/>
+    </w:p>
+    <w:p>
+      <w:r>
+        <w:t>Pour faire fonctionner le système de tickets, les données sont structurées en deux grandes familles de tables : celles qui stockent les informations brutes, et celles qui font le lien entre elles.</w:t>
+      </w:r>
+    </w:p>
+    <w:p>
+      <w:pPr>
+        <w:pStyle w:val="Titre2"/>
+      </w:pPr>
+      <w:bookmarkStart w:id="8" w:name="_Toc230828029"/>
+      <w:r>
+        <w:t>Les tables principales</w:t>
+      </w:r>
+      <w:bookmarkEnd w:id="8"/>
+    </w:p>
+    <w:p>
+      <w:r>
+        <w:t>Chaque table principale a une responsabilité unique et bien définie.</w:t>
+      </w:r>
+    </w:p>
+    <w:p>
+      <w:pPr>
+        <w:pStyle w:val="Paragraphedeliste"/>
+        <w:numPr>
+          <w:ilvl w:val="0"/>
+          <w:numId w:val="12"/>
+        </w:numPr>
+      </w:pPr>
+      <w:r>
+        <w:t xml:space="preserve">La table </w:t>
+      </w:r>
+      <w:r>
+        <w:rPr>
+          <w:rFonts w:ascii="Cascadia Code" w:eastAsia="Yu Gothic UI Semibold" w:hAnsi="Cascadia Code" w:cs="Cascadia Code"/>
+          <w:i/>
+          <w:iCs/>
+          <w:color w:val="FFFF00"/>
+          <w:highlight w:val="black"/>
+        </w:rPr>
+        <w:t>user</w:t>
+      </w:r>
+      <w:r>
+        <w:rPr>
+          <w:rFonts w:ascii="Cascadia Code" w:hAnsi="Cascadia Code" w:cs="Cascadia Code"/>
+        </w:rPr>
+        <w:t xml:space="preserve"> </w:t>
+      </w:r>
+      <w:r>
+        <w:t>s'occupe exclusivement de la sécurité : elle recense les identifiants et les mots de passe, autrement dit elle sait qui a le droit de se connecter, rien de plus.</w:t>
+      </w:r>
+    </w:p>
+    <w:p>
+      <w:pPr>
+        <w:pStyle w:val="Paragraphedeliste"/>
+        <w:numPr>
+          <w:ilvl w:val="0"/>
+          <w:numId w:val="12"/>
+        </w:numPr>
+      </w:pPr>
+      <w:r>
+        <w:t xml:space="preserve">La table </w:t>
+      </w:r>
+      <w:r>
+        <w:rPr>
+          <w:rFonts w:ascii="Cascadia Code" w:eastAsia="Yu Gothic UI Semibold" w:hAnsi="Cascadia Code" w:cs="Cascadia Code"/>
+          <w:i/>
+          <w:iCs/>
+          <w:color w:val="FFFF00"/>
+          <w:highlight w:val="black"/>
+        </w:rPr>
+        <w:t>tech</w:t>
+      </w:r>
+      <w:r>
+        <w:t xml:space="preserve"> est l'annuaire du personnel. Elle liste les techniciens avec leur nom, prénom et adresse </w:t>
+      </w:r>
+      <w:r>
+        <w:t>courriel</w:t>
+      </w:r>
+      <w:r>
+        <w:t>. Elle dit qui travaille dans l'entreprise, mais pas ce que ces personnes font.</w:t>
+      </w:r>
+    </w:p>
+    <w:p>
+      <w:pPr>
+        <w:pStyle w:val="Paragraphedeliste"/>
+        <w:numPr>
+          <w:ilvl w:val="0"/>
+          <w:numId w:val="12"/>
+        </w:numPr>
+      </w:pPr>
+      <w:r>
+        <w:t xml:space="preserve">La table </w:t>
+      </w:r>
+      <w:r>
+        <w:rPr>
+          <w:rFonts w:ascii="Cascadia Code" w:eastAsia="Yu Gothic UI Semibold" w:hAnsi="Cascadia Code" w:cs="Cascadia Code"/>
+          <w:i/>
+          <w:iCs/>
+          <w:color w:val="FFFF00"/>
+          <w:highlight w:val="black"/>
+        </w:rPr>
+        <w:t>fonction</w:t>
+      </w:r>
+      <w:r>
+        <w:t xml:space="preserve"> est le catalogue des compétences disponibles : "Dev </w:t>
+      </w:r>
+      <w:r>
+        <w:t>frontend</w:t>
+      </w:r>
+      <w:r>
+        <w:t xml:space="preserve">", "Dev </w:t>
+      </w:r>
+      <w:r>
+        <w:t>backend</w:t>
+      </w:r>
+      <w:r>
+        <w:t>", "Chef de projet", "Full stack", etc.</w:t>
+      </w:r>
+    </w:p>
+    <w:p>
+      <w:pPr>
+        <w:pStyle w:val="Paragraphedeliste"/>
+        <w:numPr>
+          <w:ilvl w:val="0"/>
+          <w:numId w:val="12"/>
+        </w:numPr>
+      </w:pPr>
+      <w:r>
+        <w:t xml:space="preserve">Enfin, les tables </w:t>
+      </w:r>
+      <w:r>
+        <w:rPr>
+          <w:rFonts w:ascii="Cascadia Code" w:eastAsia="Yu Gothic UI Semibold" w:hAnsi="Cascadia Code" w:cs="Cascadia Code"/>
+          <w:i/>
+          <w:iCs/>
+          <w:color w:val="FFFF00"/>
+          <w:highlight w:val="black"/>
+        </w:rPr>
+        <w:t>project</w:t>
+      </w:r>
+      <w:r>
+        <w:t xml:space="preserve"> et </w:t>
+      </w:r>
+      <w:r>
+        <w:rPr>
+          <w:rFonts w:ascii="Cascadia Code" w:eastAsia="Yu Gothic UI Semibold" w:hAnsi="Cascadia Code" w:cs="Cascadia Code"/>
+          <w:i/>
+          <w:iCs/>
+          <w:color w:val="FFFF00"/>
+          <w:highlight w:val="black"/>
+        </w:rPr>
+        <w:t>job</w:t>
+      </w:r>
+      <w:r>
+        <w:t xml:space="preserve"> sont les fiches de travail. Le projet est le dossier global (ex. : "Projet Ticket System") et les jobs sont les tâches concrètes à réaliser à l'intérieur (ex. : "Développement backend PHP").</w:t>
+      </w:r>
+    </w:p>
+    <w:p>
+      <w:pPr>
+        <w:pStyle w:val="Titre2"/>
+      </w:pPr>
+      <w:bookmarkStart w:id="9" w:name="_Toc230828030"/>
+      <w:r>
+        <w:t>Les tables de jointure</w:t>
+      </w:r>
+      <w:bookmarkEnd w:id="9"/>
+    </w:p>
+    <w:p>
+      <w:r>
+        <w:t>La réalité du terrain est rarement aussi simple qu'un organigramme. Un technicien peut maîtriser plusieurs compétences, plusieurs personnes peuvent partager la même qualification, et un ticket complexe mobilise souvent toute une équipe. Pour retranscrire fidèlement cette réalité, deux tables de jointure ont été créées afin de gérer des relations de type "plusieurs-à-plusieurs".</w:t>
+      </w:r>
+    </w:p>
+    <w:p>
+      <w:pPr>
+        <w:pStyle w:val="Titre3"/>
+      </w:pPr>
+      <w:bookmarkStart w:id="10" w:name="_Toc230828031"/>
+      <w:proofErr w:type="gramStart"/>
+      <w:r>
+        <w:rPr>
+          <w:rFonts w:ascii="Cascadia Code" w:eastAsia="Yu Gothic UI Semibold" w:hAnsi="Cascadia Code" w:cs="Cascadia Code"/>
+          <w:i/>
+          <w:iCs/>
+          <w:color w:val="FFFF00"/>
+          <w:highlight w:val="black"/>
+        </w:rPr>
+        <w:t>fonction</w:t>
+      </w:r>
+      <w:proofErr w:type="gramEnd"/>
+      <w:r>
+        <w:rPr>
+          <w:rFonts w:ascii="Cascadia Code" w:eastAsia="Yu Gothic UI Semibold" w:hAnsi="Cascadia Code" w:cs="Cascadia Code"/>
+          <w:i/>
+          <w:iCs/>
+          <w:color w:val="FFFF00"/>
+          <w:highlight w:val="black"/>
+        </w:rPr>
+        <w:t>_tech</w:t>
+      </w:r>
+      <w:r>
+        <w:t xml:space="preserve"> — la gestion des profils</w:t>
+      </w:r>
+      <w:bookmarkEnd w:id="10"/>
+    </w:p>
+    <w:p>
+      <w:r>
+        <w:t xml:space="preserve">Rattacher un technicien à une seule compétence aurait été trop rigide. Dans la pratique, la polyvalence est la règle : un même agent peut très bien être à la fois développeur </w:t>
+      </w:r>
+      <w:r>
+        <w:t>frontend</w:t>
+      </w:r>
+      <w:r>
+        <w:t xml:space="preserve"> et développeur </w:t>
+      </w:r>
+      <w:r>
+        <w:t>backend</w:t>
+      </w:r>
+      <w:r>
+        <w:t>. Cette table fait donc le pont entre les techniciens et leurs qualifications, de façon souple et dynamique.</w:t>
+      </w:r>
+    </w:p>
+    <w:p>
+      <w:pPr>
+        <w:pStyle w:val="Titre3"/>
+      </w:pPr>
+      <w:bookmarkStart w:id="11" w:name="_Toc230828032"/>
+      <w:proofErr w:type="gramStart"/>
+      <w:r>
+        <w:rPr>
+          <w:rFonts w:ascii="Cascadia Code" w:eastAsia="Yu Gothic UI Semibold" w:hAnsi="Cascadia Code" w:cs="Cascadia Code"/>
+          <w:i/>
+          <w:iCs/>
+          <w:color w:val="FFFF00"/>
+          <w:highlight w:val="black"/>
+        </w:rPr>
+        <w:t>tech</w:t>
+      </w:r>
+      <w:proofErr w:type="gramEnd"/>
+      <w:r>
+        <w:rPr>
+          <w:rFonts w:ascii="Cascadia Code" w:eastAsia="Yu Gothic UI Semibold" w:hAnsi="Cascadia Code" w:cs="Cascadia Code"/>
+          <w:i/>
+          <w:iCs/>
+          <w:color w:val="FFFF00"/>
+          <w:highlight w:val="black"/>
+        </w:rPr>
+        <w:t>_jobs</w:t>
+      </w:r>
+      <w:r>
+        <w:t xml:space="preserve"> — la gestion des affectations</w:t>
+      </w:r>
+      <w:bookmarkEnd w:id="11"/>
+    </w:p>
+    <w:p>
+      <w:pPr>
+        <w:rPr>
+          <w:i/>
+          <w:iCs/>
+        </w:rPr>
+      </w:pPr>
+      <w:r>
+        <w:t xml:space="preserve">Face à un ticket complexe, l'entreprise envoie souvent plusieurs intervenants. Et un même technicien peut, sur une même période, jongler entre plusieurs missions. Cette table formalise ces affectations : elle croise chaque ticket avec les techniciens qui y sont assignés, ce qui permet à l'application d'afficher en temps réel qui travaille sur quoi — par exemple : </w:t>
+      </w:r>
+      <w:r>
+        <w:rPr>
+          <w:i/>
+          <w:iCs/>
+        </w:rPr>
+        <w:t>"Sur ce ticket, Jean et Marc sont affectés."</w:t>
+      </w:r>
+    </w:p>
+    <w:p>
+      <w:pPr>
+        <w:rPr>
+          <w:i/>
+          <w:iCs/>
+        </w:rPr>
+      </w:pPr>
+    </w:p>
+    <w:p>
+      <w:pPr>
+        <w:pStyle w:val="Citation"/>
+        <w:rPr>
+          <w:rStyle w:val="Accentuationlgre"/>
+          <w:i/>
+          <w:iCs/>
+        </w:rPr>
+      </w:pPr>
+      <w:r>
+        <w:lastRenderedPageBreak/>
+        <w:t>Voir en annexe</w:t>
+      </w:r>
+      <w:r>
+        <w:t xml:space="preserve">’Diagramme </w:t>
+      </w:r>
+      <w:r>
+        <w:t>DB</w:t>
+      </w:r>
+      <w:r>
+        <w:t>’</w:t>
+      </w:r>
+      <w:r>
+        <w:t xml:space="preserve"> le digramme de base de </w:t>
+      </w:r>
+      <w:r>
+        <w:t>données</w:t>
       </w:r>
     </w:p>
     <w:p>
@@ -4400,6 +6283,7 @@
           <w:color w:val="0F4761" w:themeColor="accent1" w:themeShade="BF"/>
         </w:rPr>
       </w:pPr>
+      <w:bookmarkStart w:id="12" w:name="_Toc230828033"/>
       <w:r>
         <w:rPr>
           <w:rStyle w:val="Accentuationlgre"/>
@@ -4407,7 +6291,17 @@
           <w:iCs w:val="0"/>
           <w:color w:val="0F4761" w:themeColor="accent1" w:themeShade="BF"/>
         </w:rPr>
-        <w:t xml:space="preserve">Procédure de déploiement </w:t>
+        <w:t>Procédure de déploiement</w:t>
+      </w:r>
+      <w:bookmarkEnd w:id="12"/>
+      <w:r>
+        <w:rPr>
+          <w:rStyle w:val="Accentuationlgre"/>
+          <w:i w:val="0"/>
+          <w:iCs w:val="0"/>
+          <w:color w:val="0F4761" w:themeColor="accent1" w:themeShade="BF"/>
+        </w:rPr>
+        <w:t xml:space="preserve"> </w:t>
       </w:r>
     </w:p>
     <w:p>
@@ -4415,13 +6309,30 @@
         <w:pStyle w:val="Titre1"/>
         <w:rPr>
           <w:rStyle w:val="Accentuationlgre"/>
+          <w:i w:val="0"/>
+          <w:iCs w:val="0"/>
+          <w:color w:val="0F4761" w:themeColor="accent1" w:themeShade="BF"/>
         </w:rPr>
       </w:pPr>
+      <w:bookmarkStart w:id="13" w:name="_Toc230828034"/>
       <w:r>
         <w:rPr>
           <w:rStyle w:val="Accentuationlgre"/>
+          <w:i w:val="0"/>
+          <w:iCs w:val="0"/>
+          <w:color w:val="0F4761" w:themeColor="accent1" w:themeShade="BF"/>
         </w:rPr>
-        <w:t xml:space="preserve">Mode d’emploi utilisateur sommaire </w:t>
+        <w:t>Mode d’emploi utilisateur sommaire</w:t>
+      </w:r>
+      <w:bookmarkEnd w:id="13"/>
+      <w:r>
+        <w:rPr>
+          <w:rStyle w:val="Accentuationlgre"/>
+          <w:i w:val="0"/>
+          <w:iCs w:val="0"/>
+          <w:color w:val="0F4761" w:themeColor="accent1" w:themeShade="BF"/>
+        </w:rPr>
+        <w:t xml:space="preserve"> </w:t>
       </w:r>
     </w:p>
     <w:p>
@@ -4429,13 +6340,190 @@
         <w:pStyle w:val="Titre1"/>
         <w:rPr>
           <w:rStyle w:val="Accentuationlgre"/>
+          <w:i w:val="0"/>
+          <w:iCs w:val="0"/>
+          <w:color w:val="0F4761" w:themeColor="accent1" w:themeShade="BF"/>
         </w:rPr>
       </w:pPr>
+      <w:bookmarkStart w:id="14" w:name="_Toc230828035"/>
       <w:r>
         <w:rPr>
           <w:rStyle w:val="Accentuationlgre"/>
+          <w:i w:val="0"/>
+          <w:iCs w:val="0"/>
+          <w:color w:val="0F4761" w:themeColor="accent1" w:themeShade="BF"/>
         </w:rPr>
-        <w:t xml:space="preserve">Descriptions des relations DB et Classes </w:t>
+        <w:t>Descriptions des relations DB et Classes</w:t>
+      </w:r>
+      <w:bookmarkEnd w:id="14"/>
+      <w:r>
+        <w:rPr>
+          <w:rStyle w:val="Accentuationlgre"/>
+          <w:i w:val="0"/>
+          <w:iCs w:val="0"/>
+          <w:color w:val="0F4761" w:themeColor="accent1" w:themeShade="BF"/>
+        </w:rPr>
+        <w:t xml:space="preserve"> </w:t>
+      </w:r>
+    </w:p>
+    <w:p>
+      <w:pPr>
+        <w:pStyle w:val="Titre1"/>
+      </w:pPr>
+      <w:bookmarkStart w:id="15" w:name="_Toc230828036"/>
+      <w:r>
+        <w:t>Annexe</w:t>
+      </w:r>
+      <w:bookmarkEnd w:id="15"/>
+      <w:r>
+        <w:t xml:space="preserve"> </w:t>
+      </w:r>
+    </w:p>
+    <w:p>
+      <w:pPr>
+        <w:pStyle w:val="Titre2"/>
+      </w:pPr>
+      <w:bookmarkStart w:id="16" w:name="_Toc230828037"/>
+      <w:r>
+        <w:t>Diagramme entité</w:t>
+      </w:r>
+      <w:bookmarkEnd w:id="16"/>
+      <w:r>
+        <w:t xml:space="preserve"> </w:t>
+      </w:r>
+    </w:p>
+    <w:p>
+      <w:r>
+        <w:drawing>
+          <wp:inline distT="0" distB="0" distL="0" distR="0" wp14:anchorId="1F4961A6" wp14:editId="41661711">
+            <wp:extent cx="5760720" cy="1052195"/>
+            <wp:effectExtent l="0" t="0" r="0" b="0"/>
+            <wp:docPr id="1615758599" name="Image 1"/>
+            <wp:cNvGraphicFramePr>
+              <a:graphicFrameLocks xmlns:a="http://schemas.openxmlformats.org/drawingml/2006/main" noChangeAspect="1"/>
+            </wp:cNvGraphicFramePr>
+            <a:graphic xmlns:a="http://schemas.openxmlformats.org/drawingml/2006/main">
+              <a:graphicData uri="http://schemas.openxmlformats.org/drawingml/2006/picture">
+                <pic:pic xmlns:pic="http://schemas.openxmlformats.org/drawingml/2006/picture">
+                  <pic:nvPicPr>
+                    <pic:cNvPr id="1615758599" name=""/>
+                    <pic:cNvPicPr/>
+                  </pic:nvPicPr>
+                  <pic:blipFill>
+                    <a:blip r:embed="rId8"/>
+                    <a:stretch>
+                      <a:fillRect/>
+                    </a:stretch>
+                  </pic:blipFill>
+                  <pic:spPr>
+                    <a:xfrm>
+                      <a:off x="0" y="0"/>
+                      <a:ext cx="5760720" cy="1052195"/>
+                    </a:xfrm>
+                    <a:prstGeom prst="rect">
+                      <a:avLst/>
+                    </a:prstGeom>
+                  </pic:spPr>
+                </pic:pic>
+              </a:graphicData>
+            </a:graphic>
+          </wp:inline>
+        </w:drawing>
+      </w:r>
+    </w:p>
+    <w:p>
+      <w:r>
+        <w:drawing>
+          <wp:inline distT="0" distB="0" distL="0" distR="0" wp14:anchorId="2AC89492" wp14:editId="4EAFEFEB">
+            <wp:extent cx="5760720" cy="3909695"/>
+            <wp:effectExtent l="0" t="0" r="0" b="0"/>
+            <wp:docPr id="1778830025" name="Image 1"/>
+            <wp:cNvGraphicFramePr>
+              <a:graphicFrameLocks xmlns:a="http://schemas.openxmlformats.org/drawingml/2006/main" noChangeAspect="1"/>
+            </wp:cNvGraphicFramePr>
+            <a:graphic xmlns:a="http://schemas.openxmlformats.org/drawingml/2006/main">
+              <a:graphicData uri="http://schemas.openxmlformats.org/drawingml/2006/picture">
+                <pic:pic xmlns:pic="http://schemas.openxmlformats.org/drawingml/2006/picture">
+                  <pic:nvPicPr>
+                    <pic:cNvPr id="1778830025" name=""/>
+                    <pic:cNvPicPr/>
+                  </pic:nvPicPr>
+                  <pic:blipFill>
+                    <a:blip r:embed="rId9"/>
+                    <a:stretch>
+                      <a:fillRect/>
+                    </a:stretch>
+                  </pic:blipFill>
+                  <pic:spPr>
+                    <a:xfrm>
+                      <a:off x="0" y="0"/>
+                      <a:ext cx="5760720" cy="3909695"/>
+                    </a:xfrm>
+                    <a:prstGeom prst="rect">
+                      <a:avLst/>
+                    </a:prstGeom>
+                  </pic:spPr>
+                </pic:pic>
+              </a:graphicData>
+            </a:graphic>
+          </wp:inline>
+        </w:drawing>
+      </w:r>
+    </w:p>
+    <w:p>
+      <w:pPr>
+        <w:pStyle w:val="Titre2"/>
+      </w:pPr>
+      <w:bookmarkStart w:id="17" w:name="_Toc230828038"/>
+      <w:r>
+        <w:lastRenderedPageBreak/>
+        <w:t>Di</w:t>
+      </w:r>
+      <w:r>
+        <w:t>a</w:t>
+      </w:r>
+      <w:r>
+        <w:t>gramme DB</w:t>
+      </w:r>
+      <w:bookmarkEnd w:id="17"/>
+    </w:p>
+    <w:p>
+      <w:r>
+        <w:drawing>
+          <wp:inline distT="0" distB="0" distL="0" distR="0" wp14:anchorId="23342E0C" wp14:editId="1F9A9682">
+            <wp:extent cx="5760720" cy="4772660"/>
+            <wp:effectExtent l="0" t="0" r="0" b="8890"/>
+            <wp:docPr id="589448969" name="Image 1"/>
+            <wp:cNvGraphicFramePr>
+              <a:graphicFrameLocks xmlns:a="http://schemas.openxmlformats.org/drawingml/2006/main" noChangeAspect="1"/>
+            </wp:cNvGraphicFramePr>
+            <a:graphic xmlns:a="http://schemas.openxmlformats.org/drawingml/2006/main">
+              <a:graphicData uri="http://schemas.openxmlformats.org/drawingml/2006/picture">
+                <pic:pic xmlns:pic="http://schemas.openxmlformats.org/drawingml/2006/picture">
+                  <pic:nvPicPr>
+                    <pic:cNvPr id="589448969" name=""/>
+                    <pic:cNvPicPr/>
+                  </pic:nvPicPr>
+                  <pic:blipFill>
+                    <a:blip r:embed="rId10"/>
+                    <a:stretch>
+                      <a:fillRect/>
+                    </a:stretch>
+                  </pic:blipFill>
+                  <pic:spPr>
+                    <a:xfrm>
+                      <a:off x="0" y="0"/>
+                      <a:ext cx="5760720" cy="4772660"/>
+                    </a:xfrm>
+                    <a:prstGeom prst="rect">
+                      <a:avLst/>
+                    </a:prstGeom>
+                  </pic:spPr>
+                </pic:pic>
+              </a:graphicData>
+            </a:graphic>
+          </wp:inline>
+        </w:drawing>
       </w:r>
     </w:p>
     <w:p>
@@ -4455,6 +6543,8 @@
       </w:r>
     </w:p>
     <w:sectPr>
+      <w:footerReference w:type="default" r:id="rId11"/>
+      <w:footerReference w:type="first" r:id="rId12"/>
       <w:pgSz w:w="11906" w:h="16838"/>
       <w:pgMar w:top="1417" w:right="1417" w:bottom="1417" w:left="1417" w:header="708" w:footer="708" w:gutter="0"/>
       <w:pgNumType w:start="0"/>
@@ -4466,9 +6556,1778 @@
 </w:document>
 </file>
 
+<file path=word/endnotes.xml><?xml version="1.0" encoding="utf-8"?>
+<w:endnotes xmlns:wpc="http://schemas.microsoft.com/office/word/2010/wordprocessingCanvas" xmlns:cx="http://schemas.microsoft.com/office/drawing/2014/chartex" xmlns:cx1="http://schemas.microsoft.com/office/drawing/2015/9/8/chartex" xmlns:cx2="http://schemas.microsoft.com/office/drawing/2015/10/21/chartex" xmlns:cx3="http://schemas.microsoft.com/office/drawing/2016/5/9/chartex" xmlns:cx4="http://schemas.microsoft.com/office/drawing/2016/5/10/chartex" xmlns:cx5="http://schemas.microsoft.com/office/drawing/2016/5/11/chartex" xmlns:cx6="http://schemas.microsoft.com/office/drawing/2016/5/12/chartex" xmlns:cx7="http://schemas.microsoft.com/office/drawing/2016/5/13/chartex" xmlns:cx8="http://schemas.microsoft.com/office/drawing/2016/5/14/chartex" xmlns:mc="http://schemas.openxmlformats.org/markup-compatibility/2006" xmlns:aink="http://schemas.microsoft.com/office/drawing/2016/ink" xmlns:am3d="http://schemas.microsoft.com/office/drawing/2017/model3d" xmlns:o="urn:schemas-microsoft-com:office:office" xmlns:oel="http://schemas.microsoft.com/office/2019/extlst" xmlns:r="http://schemas.openxmlformats.org/officeDocument/2006/relationships" xmlns:m="http://schemas.openxmlformats.org/officeDocument/2006/math" xmlns:v="urn:schemas-microsoft-com:vml" xmlns:wp14="http://schemas.microsoft.com/office/word/2010/wordprocessingDrawing" xmlns:wp="http://schemas.openxmlformats.org/drawingml/2006/wordprocessingDrawing" xmlns:w10="urn:schemas-microsoft-com:office:word" xmlns:w="http://schemas.openxmlformats.org/wordprocessingml/2006/main" xmlns:w14="http://schemas.microsoft.com/office/word/2010/wordml" xmlns:w15="http://schemas.microsoft.com/office/word/2012/wordml" xmlns:w16cex="http://schemas.microsoft.com/office/word/2018/wordml/cex" xmlns:w16cid="http://schemas.microsoft.com/office/word/2016/wordml/cid" xmlns:w16="http://schemas.microsoft.com/office/word/2018/wordml" xmlns:w16du="http://schemas.microsoft.com/office/word/2023/wordml/word16du" xmlns:w16sdtdh="http://schemas.microsoft.com/office/word/2020/wordml/sdtdatahash" xmlns:w16sdtfl="http://schemas.microsoft.com/office/word/2024/wordml/sdtformatlock" xmlns:w16se="http://schemas.microsoft.com/office/word/2015/wordml/symex" xmlns:wpg="http://schemas.microsoft.com/office/word/2010/wordprocessingGroup" xmlns:wpi="http://schemas.microsoft.com/office/word/2010/wordprocessingInk" xmlns:wne="http://schemas.microsoft.com/office/word/2006/wordml" xmlns:wps="http://schemas.microsoft.com/office/word/2010/wordprocessingShape" mc:Ignorable="w14 w15 w16se w16cid w16 w16cex w16sdtdh w16sdtfl w16du wp14">
+  <w:endnote w:type="separator" w:id="-1">
+    <w:p>
+      <w:pPr>
+        <w:spacing w:after="0" w:line="240" w:lineRule="auto"/>
+      </w:pPr>
+      <w:r>
+        <w:separator/>
+      </w:r>
+    </w:p>
+  </w:endnote>
+  <w:endnote w:type="continuationSeparator" w:id="0">
+    <w:p>
+      <w:pPr>
+        <w:spacing w:after="0" w:line="240" w:lineRule="auto"/>
+      </w:pPr>
+      <w:r>
+        <w:continuationSeparator/>
+      </w:r>
+    </w:p>
+  </w:endnote>
+</w:endnotes>
+</file>
+
+<file path=word/footer1.xml><?xml version="1.0" encoding="utf-8"?>
+<w:ftr xmlns:wpc="http://schemas.microsoft.com/office/word/2010/wordprocessingCanvas" xmlns:cx="http://schemas.microsoft.com/office/drawing/2014/chartex" xmlns:cx1="http://schemas.microsoft.com/office/drawing/2015/9/8/chartex" xmlns:cx2="http://schemas.microsoft.com/office/drawing/2015/10/21/chartex" xmlns:cx3="http://schemas.microsoft.com/office/drawing/2016/5/9/chartex" xmlns:cx4="http://schemas.microsoft.com/office/drawing/2016/5/10/chartex" xmlns:cx5="http://schemas.microsoft.com/office/drawing/2016/5/11/chartex" xmlns:cx6="http://schemas.microsoft.com/office/drawing/2016/5/12/chartex" xmlns:cx7="http://schemas.microsoft.com/office/drawing/2016/5/13/chartex" xmlns:cx8="http://schemas.microsoft.com/office/drawing/2016/5/14/chartex" xmlns:mc="http://schemas.openxmlformats.org/markup-compatibility/2006" xmlns:aink="http://schemas.microsoft.com/office/drawing/2016/ink" xmlns:am3d="http://schemas.microsoft.com/office/drawing/2017/model3d" xmlns:o="urn:schemas-microsoft-com:office:office" xmlns:oel="http://schemas.microsoft.com/office/2019/extlst" xmlns:r="http://schemas.openxmlformats.org/officeDocument/2006/relationships" xmlns:m="http://schemas.openxmlformats.org/officeDocument/2006/math" xmlns:v="urn:schemas-microsoft-com:vml" xmlns:wp14="http://schemas.microsoft.com/office/word/2010/wordprocessingDrawing" xmlns:wp="http://schemas.openxmlformats.org/drawingml/2006/wordprocessingDrawing" xmlns:w10="urn:schemas-microsoft-com:office:word" xmlns:w="http://schemas.openxmlformats.org/wordprocessingml/2006/main" xmlns:w14="http://schemas.microsoft.com/office/word/2010/wordml" xmlns:w15="http://schemas.microsoft.com/office/word/2012/wordml" xmlns:w16cex="http://schemas.microsoft.com/office/word/2018/wordml/cex" xmlns:w16cid="http://schemas.microsoft.com/office/word/2016/wordml/cid" xmlns:w16="http://schemas.microsoft.com/office/word/2018/wordml" xmlns:w16du="http://schemas.microsoft.com/office/word/2023/wordml/word16du" xmlns:w16sdtdh="http://schemas.microsoft.com/office/word/2020/wordml/sdtdatahash" xmlns:w16sdtfl="http://schemas.microsoft.com/office/word/2024/wordml/sdtformatlock" xmlns:w16se="http://schemas.microsoft.com/office/word/2015/wordml/symex" xmlns:wpg="http://schemas.microsoft.com/office/word/2010/wordprocessingGroup" xmlns:wpi="http://schemas.microsoft.com/office/word/2010/wordprocessingInk" xmlns:wne="http://schemas.microsoft.com/office/word/2006/wordml" xmlns:wps="http://schemas.microsoft.com/office/word/2010/wordprocessingShape" mc:Ignorable="w14 w15 w16se w16cid w16 w16cex w16sdtdh w16sdtfl w16du wp14">
+  <w:sdt>
+    <w:sdtPr>
+      <w:id w:val="325330684"/>
+      <w:docPartObj>
+        <w:docPartGallery w:val="Page Numbers (Bottom of Page)"/>
+        <w:docPartUnique/>
+      </w:docPartObj>
+    </w:sdtPr>
+    <w:sdtContent>
+      <w:p>
+        <w:pPr>
+          <w:pStyle w:val="Pieddepage"/>
+          <w:jc w:val="right"/>
+        </w:pPr>
+        <w:r>
+          <w:fldChar w:fldCharType="begin"/>
+        </w:r>
+        <w:r>
+          <w:instrText>PAGE   \* MERGEFORMAT</w:instrText>
+        </w:r>
+        <w:r>
+          <w:fldChar w:fldCharType="separate"/>
+        </w:r>
+        <w:r>
+          <w:t>2</w:t>
+        </w:r>
+        <w:r>
+          <w:fldChar w:fldCharType="end"/>
+        </w:r>
+      </w:p>
+    </w:sdtContent>
+  </w:sdt>
+  <w:p>
+    <w:pPr>
+      <w:pStyle w:val="Pieddepage"/>
+    </w:pPr>
+  </w:p>
+</w:ftr>
+</file>
+
+<file path=word/footer2.xml><?xml version="1.0" encoding="utf-8"?>
+<w:ftr xmlns:wpc="http://schemas.microsoft.com/office/word/2010/wordprocessingCanvas" xmlns:cx="http://schemas.microsoft.com/office/drawing/2014/chartex" xmlns:cx1="http://schemas.microsoft.com/office/drawing/2015/9/8/chartex" xmlns:cx2="http://schemas.microsoft.com/office/drawing/2015/10/21/chartex" xmlns:cx3="http://schemas.microsoft.com/office/drawing/2016/5/9/chartex" xmlns:cx4="http://schemas.microsoft.com/office/drawing/2016/5/10/chartex" xmlns:cx5="http://schemas.microsoft.com/office/drawing/2016/5/11/chartex" xmlns:cx6="http://schemas.microsoft.com/office/drawing/2016/5/12/chartex" xmlns:cx7="http://schemas.microsoft.com/office/drawing/2016/5/13/chartex" xmlns:cx8="http://schemas.microsoft.com/office/drawing/2016/5/14/chartex" xmlns:mc="http://schemas.openxmlformats.org/markup-compatibility/2006" xmlns:aink="http://schemas.microsoft.com/office/drawing/2016/ink" xmlns:am3d="http://schemas.microsoft.com/office/drawing/2017/model3d" xmlns:o="urn:schemas-microsoft-com:office:office" xmlns:oel="http://schemas.microsoft.com/office/2019/extlst" xmlns:r="http://schemas.openxmlformats.org/officeDocument/2006/relationships" xmlns:m="http://schemas.openxmlformats.org/officeDocument/2006/math" xmlns:v="urn:schemas-microsoft-com:vml" xmlns:wp14="http://schemas.microsoft.com/office/word/2010/wordprocessingDrawing" xmlns:wp="http://schemas.openxmlformats.org/drawingml/2006/wordprocessingDrawing" xmlns:w10="urn:schemas-microsoft-com:office:word" xmlns:w="http://schemas.openxmlformats.org/wordprocessingml/2006/main" xmlns:w14="http://schemas.microsoft.com/office/word/2010/wordml" xmlns:w15="http://schemas.microsoft.com/office/word/2012/wordml" xmlns:w16cex="http://schemas.microsoft.com/office/word/2018/wordml/cex" xmlns:w16cid="http://schemas.microsoft.com/office/word/2016/wordml/cid" xmlns:w16="http://schemas.microsoft.com/office/word/2018/wordml" xmlns:w16du="http://schemas.microsoft.com/office/word/2023/wordml/word16du" xmlns:w16sdtdh="http://schemas.microsoft.com/office/word/2020/wordml/sdtdatahash" xmlns:w16sdtfl="http://schemas.microsoft.com/office/word/2024/wordml/sdtformatlock" xmlns:w16se="http://schemas.microsoft.com/office/word/2015/wordml/symex" xmlns:wpg="http://schemas.microsoft.com/office/word/2010/wordprocessingGroup" xmlns:wpi="http://schemas.microsoft.com/office/word/2010/wordprocessingInk" xmlns:wne="http://schemas.microsoft.com/office/word/2006/wordml" xmlns:wps="http://schemas.microsoft.com/office/word/2010/wordprocessingShape" mc:Ignorable="w14 w15 w16se w16cid w16 w16cex w16sdtdh w16sdtfl w16du wp14">
+  <w:sdt>
+    <w:sdtPr>
+      <w:id w:val="916134653"/>
+      <w:docPartObj>
+        <w:docPartGallery w:val="Page Numbers (Bottom of Page)"/>
+        <w:docPartUnique/>
+      </w:docPartObj>
+    </w:sdtPr>
+    <w:sdtContent>
+      <w:p>
+        <w:pPr>
+          <w:pStyle w:val="Pieddepage"/>
+          <w:jc w:val="right"/>
+        </w:pPr>
+      </w:p>
+      <w:p>
+        <w:pPr>
+          <w:pStyle w:val="Pieddepage"/>
+          <w:jc w:val="right"/>
+        </w:pPr>
+      </w:p>
+    </w:sdtContent>
+  </w:sdt>
+  <w:p>
+    <w:pPr>
+      <w:pStyle w:val="Pieddepage"/>
+    </w:pPr>
+  </w:p>
+</w:ftr>
+</file>
+
+<file path=word/footnotes.xml><?xml version="1.0" encoding="utf-8"?>
+<w:footnotes xmlns:wpc="http://schemas.microsoft.com/office/word/2010/wordprocessingCanvas" xmlns:cx="http://schemas.microsoft.com/office/drawing/2014/chartex" xmlns:cx1="http://schemas.microsoft.com/office/drawing/2015/9/8/chartex" xmlns:cx2="http://schemas.microsoft.com/office/drawing/2015/10/21/chartex" xmlns:cx3="http://schemas.microsoft.com/office/drawing/2016/5/9/chartex" xmlns:cx4="http://schemas.microsoft.com/office/drawing/2016/5/10/chartex" xmlns:cx5="http://schemas.microsoft.com/office/drawing/2016/5/11/chartex" xmlns:cx6="http://schemas.microsoft.com/office/drawing/2016/5/12/chartex" xmlns:cx7="http://schemas.microsoft.com/office/drawing/2016/5/13/chartex" xmlns:cx8="http://schemas.microsoft.com/office/drawing/2016/5/14/chartex" xmlns:mc="http://schemas.openxmlformats.org/markup-compatibility/2006" xmlns:aink="http://schemas.microsoft.com/office/drawing/2016/ink" xmlns:am3d="http://schemas.microsoft.com/office/drawing/2017/model3d" xmlns:o="urn:schemas-microsoft-com:office:office" xmlns:oel="http://schemas.microsoft.com/office/2019/extlst" xmlns:r="http://schemas.openxmlformats.org/officeDocument/2006/relationships" xmlns:m="http://schemas.openxmlformats.org/officeDocument/2006/math" xmlns:v="urn:schemas-microsoft-com:vml" xmlns:wp14="http://schemas.microsoft.com/office/word/2010/wordprocessingDrawing" xmlns:wp="http://schemas.openxmlformats.org/drawingml/2006/wordprocessingDrawing" xmlns:w10="urn:schemas-microsoft-com:office:word" xmlns:w="http://schemas.openxmlformats.org/wordprocessingml/2006/main" xmlns:w14="http://schemas.microsoft.com/office/word/2010/wordml" xmlns:w15="http://schemas.microsoft.com/office/word/2012/wordml" xmlns:w16cex="http://schemas.microsoft.com/office/word/2018/wordml/cex" xmlns:w16cid="http://schemas.microsoft.com/office/word/2016/wordml/cid" xmlns:w16="http://schemas.microsoft.com/office/word/2018/wordml" xmlns:w16du="http://schemas.microsoft.com/office/word/2023/wordml/word16du" xmlns:w16sdtdh="http://schemas.microsoft.com/office/word/2020/wordml/sdtdatahash" xmlns:w16sdtfl="http://schemas.microsoft.com/office/word/2024/wordml/sdtformatlock" xmlns:w16se="http://schemas.microsoft.com/office/word/2015/wordml/symex" xmlns:wpg="http://schemas.microsoft.com/office/word/2010/wordprocessingGroup" xmlns:wpi="http://schemas.microsoft.com/office/word/2010/wordprocessingInk" xmlns:wne="http://schemas.microsoft.com/office/word/2006/wordml" xmlns:wps="http://schemas.microsoft.com/office/word/2010/wordprocessingShape" mc:Ignorable="w14 w15 w16se w16cid w16 w16cex w16sdtdh w16sdtfl w16du wp14">
+  <w:footnote w:type="separator" w:id="-1">
+    <w:p>
+      <w:pPr>
+        <w:spacing w:after="0" w:line="240" w:lineRule="auto"/>
+      </w:pPr>
+      <w:r>
+        <w:separator/>
+      </w:r>
+    </w:p>
+  </w:footnote>
+  <w:footnote w:type="continuationSeparator" w:id="0">
+    <w:p>
+      <w:pPr>
+        <w:spacing w:after="0" w:line="240" w:lineRule="auto"/>
+      </w:pPr>
+      <w:r>
+        <w:continuationSeparator/>
+      </w:r>
+    </w:p>
+  </w:footnote>
+</w:footnotes>
+</file>
+
 <file path=word/numbering.xml><?xml version="1.0" encoding="utf-8"?>
 <w:numbering xmlns:wpc="http://schemas.microsoft.com/office/word/2010/wordprocessingCanvas" xmlns:cx="http://schemas.microsoft.com/office/drawing/2014/chartex" xmlns:cx1="http://schemas.microsoft.com/office/drawing/2015/9/8/chartex" xmlns:cx2="http://schemas.microsoft.com/office/drawing/2015/10/21/chartex" xmlns:cx3="http://schemas.microsoft.com/office/drawing/2016/5/9/chartex" xmlns:cx4="http://schemas.microsoft.com/office/drawing/2016/5/10/chartex" xmlns:cx5="http://schemas.microsoft.com/office/drawing/2016/5/11/chartex" xmlns:cx6="http://schemas.microsoft.com/office/drawing/2016/5/12/chartex" xmlns:cx7="http://schemas.microsoft.com/office/drawing/2016/5/13/chartex" xmlns:cx8="http://schemas.microsoft.com/office/drawing/2016/5/14/chartex" xmlns:mc="http://schemas.openxmlformats.org/markup-compatibility/2006" xmlns:aink="http://schemas.microsoft.com/office/drawing/2016/ink" xmlns:am3d="http://schemas.microsoft.com/office/drawing/2017/model3d" xmlns:o="urn:schemas-microsoft-com:office:office" xmlns:oel="http://schemas.microsoft.com/office/2019/extlst" xmlns:r="http://schemas.openxmlformats.org/officeDocument/2006/relationships" xmlns:m="http://schemas.openxmlformats.org/officeDocument/2006/math" xmlns:v="urn:schemas-microsoft-com:vml" xmlns:wp14="http://schemas.microsoft.com/office/word/2010/wordprocessingDrawing" xmlns:wp="http://schemas.openxmlformats.org/drawingml/2006/wordprocessingDrawing" xmlns:w10="urn:schemas-microsoft-com:office:word" xmlns:w="http://schemas.openxmlformats.org/wordprocessingml/2006/main" xmlns:w14="http://schemas.microsoft.com/office/word/2010/wordml" xmlns:w15="http://schemas.microsoft.com/office/word/2012/wordml" xmlns:w16cex="http://schemas.microsoft.com/office/word/2018/wordml/cex" xmlns:w16cid="http://schemas.microsoft.com/office/word/2016/wordml/cid" xmlns:w16="http://schemas.microsoft.com/office/word/2018/wordml" xmlns:w16du="http://schemas.microsoft.com/office/word/2023/wordml/word16du" xmlns:w16sdtdh="http://schemas.microsoft.com/office/word/2020/wordml/sdtdatahash" xmlns:w16sdtfl="http://schemas.microsoft.com/office/word/2024/wordml/sdtformatlock" xmlns:w16se="http://schemas.microsoft.com/office/word/2015/wordml/symex" xmlns:wpg="http://schemas.microsoft.com/office/word/2010/wordprocessingGroup" xmlns:wpi="http://schemas.microsoft.com/office/word/2010/wordprocessingInk" xmlns:wne="http://schemas.microsoft.com/office/word/2006/wordml" xmlns:wps="http://schemas.microsoft.com/office/word/2010/wordprocessingShape" mc:Ignorable="w14 w15 w16se w16cid w16 w16cex w16sdtdh w16sdtfl w16du wp14">
   <w:abstractNum w:abstractNumId="0" w15:restartNumberingAfterBreak="0">
+    <w:nsid w:val="00167300"/>
+    <w:multiLevelType w:val="multilevel"/>
+    <w:tmpl w:val="4D48598E"/>
+    <w:lvl w:ilvl="0">
+      <w:start w:val="1"/>
+      <w:numFmt w:val="bullet"/>
+      <w:lvlText w:val=""/>
+      <w:lvlJc w:val="left"/>
+      <w:pPr>
+        <w:tabs>
+          <w:tab w:val="num" w:pos="720"/>
+        </w:tabs>
+        <w:ind w:left="720" w:hanging="360"/>
+      </w:pPr>
+      <w:rPr>
+        <w:rFonts w:ascii="Symbol" w:hAnsi="Symbol" w:hint="default"/>
+        <w:sz w:val="20"/>
+      </w:rPr>
+    </w:lvl>
+    <w:lvl w:ilvl="1" w:tentative="1">
+      <w:start w:val="1"/>
+      <w:numFmt w:val="bullet"/>
+      <w:lvlText w:val="o"/>
+      <w:lvlJc w:val="left"/>
+      <w:pPr>
+        <w:tabs>
+          <w:tab w:val="num" w:pos="1440"/>
+        </w:tabs>
+        <w:ind w:left="1440" w:hanging="360"/>
+      </w:pPr>
+      <w:rPr>
+        <w:rFonts w:ascii="Courier New" w:hAnsi="Courier New" w:hint="default"/>
+        <w:sz w:val="20"/>
+      </w:rPr>
+    </w:lvl>
+    <w:lvl w:ilvl="2" w:tentative="1">
+      <w:start w:val="1"/>
+      <w:numFmt w:val="bullet"/>
+      <w:lvlText w:val=""/>
+      <w:lvlJc w:val="left"/>
+      <w:pPr>
+        <w:tabs>
+          <w:tab w:val="num" w:pos="2160"/>
+        </w:tabs>
+        <w:ind w:left="2160" w:hanging="360"/>
+      </w:pPr>
+      <w:rPr>
+        <w:rFonts w:ascii="Wingdings" w:hAnsi="Wingdings" w:hint="default"/>
+        <w:sz w:val="20"/>
+      </w:rPr>
+    </w:lvl>
+    <w:lvl w:ilvl="3" w:tentative="1">
+      <w:start w:val="1"/>
+      <w:numFmt w:val="bullet"/>
+      <w:lvlText w:val=""/>
+      <w:lvlJc w:val="left"/>
+      <w:pPr>
+        <w:tabs>
+          <w:tab w:val="num" w:pos="2880"/>
+        </w:tabs>
+        <w:ind w:left="2880" w:hanging="360"/>
+      </w:pPr>
+      <w:rPr>
+        <w:rFonts w:ascii="Wingdings" w:hAnsi="Wingdings" w:hint="default"/>
+        <w:sz w:val="20"/>
+      </w:rPr>
+    </w:lvl>
+    <w:lvl w:ilvl="4" w:tentative="1">
+      <w:start w:val="1"/>
+      <w:numFmt w:val="bullet"/>
+      <w:lvlText w:val=""/>
+      <w:lvlJc w:val="left"/>
+      <w:pPr>
+        <w:tabs>
+          <w:tab w:val="num" w:pos="3600"/>
+        </w:tabs>
+        <w:ind w:left="3600" w:hanging="360"/>
+      </w:pPr>
+      <w:rPr>
+        <w:rFonts w:ascii="Wingdings" w:hAnsi="Wingdings" w:hint="default"/>
+        <w:sz w:val="20"/>
+      </w:rPr>
+    </w:lvl>
+    <w:lvl w:ilvl="5" w:tentative="1">
+      <w:start w:val="1"/>
+      <w:numFmt w:val="bullet"/>
+      <w:lvlText w:val=""/>
+      <w:lvlJc w:val="left"/>
+      <w:pPr>
+        <w:tabs>
+          <w:tab w:val="num" w:pos="4320"/>
+        </w:tabs>
+        <w:ind w:left="4320" w:hanging="360"/>
+      </w:pPr>
+      <w:rPr>
+        <w:rFonts w:ascii="Wingdings" w:hAnsi="Wingdings" w:hint="default"/>
+        <w:sz w:val="20"/>
+      </w:rPr>
+    </w:lvl>
+    <w:lvl w:ilvl="6" w:tentative="1">
+      <w:start w:val="1"/>
+      <w:numFmt w:val="bullet"/>
+      <w:lvlText w:val=""/>
+      <w:lvlJc w:val="left"/>
+      <w:pPr>
+        <w:tabs>
+          <w:tab w:val="num" w:pos="5040"/>
+        </w:tabs>
+        <w:ind w:left="5040" w:hanging="360"/>
+      </w:pPr>
+      <w:rPr>
+        <w:rFonts w:ascii="Wingdings" w:hAnsi="Wingdings" w:hint="default"/>
+        <w:sz w:val="20"/>
+      </w:rPr>
+    </w:lvl>
+    <w:lvl w:ilvl="7" w:tentative="1">
+      <w:start w:val="1"/>
+      <w:numFmt w:val="bullet"/>
+      <w:lvlText w:val=""/>
+      <w:lvlJc w:val="left"/>
+      <w:pPr>
+        <w:tabs>
+          <w:tab w:val="num" w:pos="5760"/>
+        </w:tabs>
+        <w:ind w:left="5760" w:hanging="360"/>
+      </w:pPr>
+      <w:rPr>
+        <w:rFonts w:ascii="Wingdings" w:hAnsi="Wingdings" w:hint="default"/>
+        <w:sz w:val="20"/>
+      </w:rPr>
+    </w:lvl>
+    <w:lvl w:ilvl="8" w:tentative="1">
+      <w:start w:val="1"/>
+      <w:numFmt w:val="bullet"/>
+      <w:lvlText w:val=""/>
+      <w:lvlJc w:val="left"/>
+      <w:pPr>
+        <w:tabs>
+          <w:tab w:val="num" w:pos="6480"/>
+        </w:tabs>
+        <w:ind w:left="6480" w:hanging="360"/>
+      </w:pPr>
+      <w:rPr>
+        <w:rFonts w:ascii="Wingdings" w:hAnsi="Wingdings" w:hint="default"/>
+        <w:sz w:val="20"/>
+      </w:rPr>
+    </w:lvl>
+  </w:abstractNum>
+  <w:abstractNum w:abstractNumId="1" w15:restartNumberingAfterBreak="0">
+    <w:nsid w:val="0B4A4B11"/>
+    <w:multiLevelType w:val="multilevel"/>
+    <w:tmpl w:val="23D0515A"/>
+    <w:lvl w:ilvl="0">
+      <w:start w:val="1"/>
+      <w:numFmt w:val="bullet"/>
+      <w:lvlText w:val=""/>
+      <w:lvlJc w:val="left"/>
+      <w:pPr>
+        <w:tabs>
+          <w:tab w:val="num" w:pos="720"/>
+        </w:tabs>
+        <w:ind w:left="720" w:hanging="360"/>
+      </w:pPr>
+      <w:rPr>
+        <w:rFonts w:ascii="Symbol" w:hAnsi="Symbol" w:hint="default"/>
+        <w:sz w:val="20"/>
+      </w:rPr>
+    </w:lvl>
+    <w:lvl w:ilvl="1" w:tentative="1">
+      <w:start w:val="1"/>
+      <w:numFmt w:val="bullet"/>
+      <w:lvlText w:val="o"/>
+      <w:lvlJc w:val="left"/>
+      <w:pPr>
+        <w:tabs>
+          <w:tab w:val="num" w:pos="1440"/>
+        </w:tabs>
+        <w:ind w:left="1440" w:hanging="360"/>
+      </w:pPr>
+      <w:rPr>
+        <w:rFonts w:ascii="Courier New" w:hAnsi="Courier New" w:hint="default"/>
+        <w:sz w:val="20"/>
+      </w:rPr>
+    </w:lvl>
+    <w:lvl w:ilvl="2" w:tentative="1">
+      <w:start w:val="1"/>
+      <w:numFmt w:val="bullet"/>
+      <w:lvlText w:val=""/>
+      <w:lvlJc w:val="left"/>
+      <w:pPr>
+        <w:tabs>
+          <w:tab w:val="num" w:pos="2160"/>
+        </w:tabs>
+        <w:ind w:left="2160" w:hanging="360"/>
+      </w:pPr>
+      <w:rPr>
+        <w:rFonts w:ascii="Wingdings" w:hAnsi="Wingdings" w:hint="default"/>
+        <w:sz w:val="20"/>
+      </w:rPr>
+    </w:lvl>
+    <w:lvl w:ilvl="3" w:tentative="1">
+      <w:start w:val="1"/>
+      <w:numFmt w:val="bullet"/>
+      <w:lvlText w:val=""/>
+      <w:lvlJc w:val="left"/>
+      <w:pPr>
+        <w:tabs>
+          <w:tab w:val="num" w:pos="2880"/>
+        </w:tabs>
+        <w:ind w:left="2880" w:hanging="360"/>
+      </w:pPr>
+      <w:rPr>
+        <w:rFonts w:ascii="Wingdings" w:hAnsi="Wingdings" w:hint="default"/>
+        <w:sz w:val="20"/>
+      </w:rPr>
+    </w:lvl>
+    <w:lvl w:ilvl="4" w:tentative="1">
+      <w:start w:val="1"/>
+      <w:numFmt w:val="bullet"/>
+      <w:lvlText w:val=""/>
+      <w:lvlJc w:val="left"/>
+      <w:pPr>
+        <w:tabs>
+          <w:tab w:val="num" w:pos="3600"/>
+        </w:tabs>
+        <w:ind w:left="3600" w:hanging="360"/>
+      </w:pPr>
+      <w:rPr>
+        <w:rFonts w:ascii="Wingdings" w:hAnsi="Wingdings" w:hint="default"/>
+        <w:sz w:val="20"/>
+      </w:rPr>
+    </w:lvl>
+    <w:lvl w:ilvl="5" w:tentative="1">
+      <w:start w:val="1"/>
+      <w:numFmt w:val="bullet"/>
+      <w:lvlText w:val=""/>
+      <w:lvlJc w:val="left"/>
+      <w:pPr>
+        <w:tabs>
+          <w:tab w:val="num" w:pos="4320"/>
+        </w:tabs>
+        <w:ind w:left="4320" w:hanging="360"/>
+      </w:pPr>
+      <w:rPr>
+        <w:rFonts w:ascii="Wingdings" w:hAnsi="Wingdings" w:hint="default"/>
+        <w:sz w:val="20"/>
+      </w:rPr>
+    </w:lvl>
+    <w:lvl w:ilvl="6" w:tentative="1">
+      <w:start w:val="1"/>
+      <w:numFmt w:val="bullet"/>
+      <w:lvlText w:val=""/>
+      <w:lvlJc w:val="left"/>
+      <w:pPr>
+        <w:tabs>
+          <w:tab w:val="num" w:pos="5040"/>
+        </w:tabs>
+        <w:ind w:left="5040" w:hanging="360"/>
+      </w:pPr>
+      <w:rPr>
+        <w:rFonts w:ascii="Wingdings" w:hAnsi="Wingdings" w:hint="default"/>
+        <w:sz w:val="20"/>
+      </w:rPr>
+    </w:lvl>
+    <w:lvl w:ilvl="7" w:tentative="1">
+      <w:start w:val="1"/>
+      <w:numFmt w:val="bullet"/>
+      <w:lvlText w:val=""/>
+      <w:lvlJc w:val="left"/>
+      <w:pPr>
+        <w:tabs>
+          <w:tab w:val="num" w:pos="5760"/>
+        </w:tabs>
+        <w:ind w:left="5760" w:hanging="360"/>
+      </w:pPr>
+      <w:rPr>
+        <w:rFonts w:ascii="Wingdings" w:hAnsi="Wingdings" w:hint="default"/>
+        <w:sz w:val="20"/>
+      </w:rPr>
+    </w:lvl>
+    <w:lvl w:ilvl="8" w:tentative="1">
+      <w:start w:val="1"/>
+      <w:numFmt w:val="bullet"/>
+      <w:lvlText w:val=""/>
+      <w:lvlJc w:val="left"/>
+      <w:pPr>
+        <w:tabs>
+          <w:tab w:val="num" w:pos="6480"/>
+        </w:tabs>
+        <w:ind w:left="6480" w:hanging="360"/>
+      </w:pPr>
+      <w:rPr>
+        <w:rFonts w:ascii="Wingdings" w:hAnsi="Wingdings" w:hint="default"/>
+        <w:sz w:val="20"/>
+      </w:rPr>
+    </w:lvl>
+  </w:abstractNum>
+  <w:abstractNum w:abstractNumId="2" w15:restartNumberingAfterBreak="0">
+    <w:nsid w:val="0C10049E"/>
+    <w:multiLevelType w:val="multilevel"/>
+    <w:tmpl w:val="7D3A7B38"/>
+    <w:lvl w:ilvl="0">
+      <w:start w:val="1"/>
+      <w:numFmt w:val="bullet"/>
+      <w:lvlText w:val=""/>
+      <w:lvlJc w:val="left"/>
+      <w:pPr>
+        <w:tabs>
+          <w:tab w:val="num" w:pos="720"/>
+        </w:tabs>
+        <w:ind w:left="720" w:hanging="360"/>
+      </w:pPr>
+      <w:rPr>
+        <w:rFonts w:ascii="Symbol" w:hAnsi="Symbol" w:hint="default"/>
+        <w:sz w:val="20"/>
+      </w:rPr>
+    </w:lvl>
+    <w:lvl w:ilvl="1" w:tentative="1">
+      <w:start w:val="1"/>
+      <w:numFmt w:val="bullet"/>
+      <w:lvlText w:val="o"/>
+      <w:lvlJc w:val="left"/>
+      <w:pPr>
+        <w:tabs>
+          <w:tab w:val="num" w:pos="1440"/>
+        </w:tabs>
+        <w:ind w:left="1440" w:hanging="360"/>
+      </w:pPr>
+      <w:rPr>
+        <w:rFonts w:ascii="Courier New" w:hAnsi="Courier New" w:hint="default"/>
+        <w:sz w:val="20"/>
+      </w:rPr>
+    </w:lvl>
+    <w:lvl w:ilvl="2" w:tentative="1">
+      <w:start w:val="1"/>
+      <w:numFmt w:val="bullet"/>
+      <w:lvlText w:val=""/>
+      <w:lvlJc w:val="left"/>
+      <w:pPr>
+        <w:tabs>
+          <w:tab w:val="num" w:pos="2160"/>
+        </w:tabs>
+        <w:ind w:left="2160" w:hanging="360"/>
+      </w:pPr>
+      <w:rPr>
+        <w:rFonts w:ascii="Wingdings" w:hAnsi="Wingdings" w:hint="default"/>
+        <w:sz w:val="20"/>
+      </w:rPr>
+    </w:lvl>
+    <w:lvl w:ilvl="3" w:tentative="1">
+      <w:start w:val="1"/>
+      <w:numFmt w:val="bullet"/>
+      <w:lvlText w:val=""/>
+      <w:lvlJc w:val="left"/>
+      <w:pPr>
+        <w:tabs>
+          <w:tab w:val="num" w:pos="2880"/>
+        </w:tabs>
+        <w:ind w:left="2880" w:hanging="360"/>
+      </w:pPr>
+      <w:rPr>
+        <w:rFonts w:ascii="Wingdings" w:hAnsi="Wingdings" w:hint="default"/>
+        <w:sz w:val="20"/>
+      </w:rPr>
+    </w:lvl>
+    <w:lvl w:ilvl="4" w:tentative="1">
+      <w:start w:val="1"/>
+      <w:numFmt w:val="bullet"/>
+      <w:lvlText w:val=""/>
+      <w:lvlJc w:val="left"/>
+      <w:pPr>
+        <w:tabs>
+          <w:tab w:val="num" w:pos="3600"/>
+        </w:tabs>
+        <w:ind w:left="3600" w:hanging="360"/>
+      </w:pPr>
+      <w:rPr>
+        <w:rFonts w:ascii="Wingdings" w:hAnsi="Wingdings" w:hint="default"/>
+        <w:sz w:val="20"/>
+      </w:rPr>
+    </w:lvl>
+    <w:lvl w:ilvl="5" w:tentative="1">
+      <w:start w:val="1"/>
+      <w:numFmt w:val="bullet"/>
+      <w:lvlText w:val=""/>
+      <w:lvlJc w:val="left"/>
+      <w:pPr>
+        <w:tabs>
+          <w:tab w:val="num" w:pos="4320"/>
+        </w:tabs>
+        <w:ind w:left="4320" w:hanging="360"/>
+      </w:pPr>
+      <w:rPr>
+        <w:rFonts w:ascii="Wingdings" w:hAnsi="Wingdings" w:hint="default"/>
+        <w:sz w:val="20"/>
+      </w:rPr>
+    </w:lvl>
+    <w:lvl w:ilvl="6" w:tentative="1">
+      <w:start w:val="1"/>
+      <w:numFmt w:val="bullet"/>
+      <w:lvlText w:val=""/>
+      <w:lvlJc w:val="left"/>
+      <w:pPr>
+        <w:tabs>
+          <w:tab w:val="num" w:pos="5040"/>
+        </w:tabs>
+        <w:ind w:left="5040" w:hanging="360"/>
+      </w:pPr>
+      <w:rPr>
+        <w:rFonts w:ascii="Wingdings" w:hAnsi="Wingdings" w:hint="default"/>
+        <w:sz w:val="20"/>
+      </w:rPr>
+    </w:lvl>
+    <w:lvl w:ilvl="7" w:tentative="1">
+      <w:start w:val="1"/>
+      <w:numFmt w:val="bullet"/>
+      <w:lvlText w:val=""/>
+      <w:lvlJc w:val="left"/>
+      <w:pPr>
+        <w:tabs>
+          <w:tab w:val="num" w:pos="5760"/>
+        </w:tabs>
+        <w:ind w:left="5760" w:hanging="360"/>
+      </w:pPr>
+      <w:rPr>
+        <w:rFonts w:ascii="Wingdings" w:hAnsi="Wingdings" w:hint="default"/>
+        <w:sz w:val="20"/>
+      </w:rPr>
+    </w:lvl>
+    <w:lvl w:ilvl="8" w:tentative="1">
+      <w:start w:val="1"/>
+      <w:numFmt w:val="bullet"/>
+      <w:lvlText w:val=""/>
+      <w:lvlJc w:val="left"/>
+      <w:pPr>
+        <w:tabs>
+          <w:tab w:val="num" w:pos="6480"/>
+        </w:tabs>
+        <w:ind w:left="6480" w:hanging="360"/>
+      </w:pPr>
+      <w:rPr>
+        <w:rFonts w:ascii="Wingdings" w:hAnsi="Wingdings" w:hint="default"/>
+        <w:sz w:val="20"/>
+      </w:rPr>
+    </w:lvl>
+  </w:abstractNum>
+  <w:abstractNum w:abstractNumId="3" w15:restartNumberingAfterBreak="0">
+    <w:nsid w:val="100B1C69"/>
+    <w:multiLevelType w:val="hybridMultilevel"/>
+    <w:tmpl w:val="E1CE395C"/>
+    <w:lvl w:ilvl="0" w:tplc="F2B0D6E0">
+      <w:start w:val="1"/>
+      <w:numFmt w:val="bullet"/>
+      <w:lvlText w:val="-"/>
+      <w:lvlJc w:val="left"/>
+      <w:pPr>
+        <w:ind w:left="720" w:hanging="360"/>
+      </w:pPr>
+      <w:rPr>
+        <w:rFonts w:ascii="Aptos" w:eastAsiaTheme="minorHAnsi" w:hAnsi="Aptos" w:cstheme="minorBidi" w:hint="default"/>
+      </w:rPr>
+    </w:lvl>
+    <w:lvl w:ilvl="1" w:tplc="040C0003" w:tentative="1">
+      <w:start w:val="1"/>
+      <w:numFmt w:val="bullet"/>
+      <w:lvlText w:val="o"/>
+      <w:lvlJc w:val="left"/>
+      <w:pPr>
+        <w:ind w:left="1440" w:hanging="360"/>
+      </w:pPr>
+      <w:rPr>
+        <w:rFonts w:ascii="Courier New" w:hAnsi="Courier New" w:cs="Courier New" w:hint="default"/>
+      </w:rPr>
+    </w:lvl>
+    <w:lvl w:ilvl="2" w:tplc="040C0005" w:tentative="1">
+      <w:start w:val="1"/>
+      <w:numFmt w:val="bullet"/>
+      <w:lvlText w:val=""/>
+      <w:lvlJc w:val="left"/>
+      <w:pPr>
+        <w:ind w:left="2160" w:hanging="360"/>
+      </w:pPr>
+      <w:rPr>
+        <w:rFonts w:ascii="Wingdings" w:hAnsi="Wingdings" w:hint="default"/>
+      </w:rPr>
+    </w:lvl>
+    <w:lvl w:ilvl="3" w:tplc="040C0001" w:tentative="1">
+      <w:start w:val="1"/>
+      <w:numFmt w:val="bullet"/>
+      <w:lvlText w:val=""/>
+      <w:lvlJc w:val="left"/>
+      <w:pPr>
+        <w:ind w:left="2880" w:hanging="360"/>
+      </w:pPr>
+      <w:rPr>
+        <w:rFonts w:ascii="Symbol" w:hAnsi="Symbol" w:hint="default"/>
+      </w:rPr>
+    </w:lvl>
+    <w:lvl w:ilvl="4" w:tplc="040C0003" w:tentative="1">
+      <w:start w:val="1"/>
+      <w:numFmt w:val="bullet"/>
+      <w:lvlText w:val="o"/>
+      <w:lvlJc w:val="left"/>
+      <w:pPr>
+        <w:ind w:left="3600" w:hanging="360"/>
+      </w:pPr>
+      <w:rPr>
+        <w:rFonts w:ascii="Courier New" w:hAnsi="Courier New" w:cs="Courier New" w:hint="default"/>
+      </w:rPr>
+    </w:lvl>
+    <w:lvl w:ilvl="5" w:tplc="040C0005" w:tentative="1">
+      <w:start w:val="1"/>
+      <w:numFmt w:val="bullet"/>
+      <w:lvlText w:val=""/>
+      <w:lvlJc w:val="left"/>
+      <w:pPr>
+        <w:ind w:left="4320" w:hanging="360"/>
+      </w:pPr>
+      <w:rPr>
+        <w:rFonts w:ascii="Wingdings" w:hAnsi="Wingdings" w:hint="default"/>
+      </w:rPr>
+    </w:lvl>
+    <w:lvl w:ilvl="6" w:tplc="040C0001" w:tentative="1">
+      <w:start w:val="1"/>
+      <w:numFmt w:val="bullet"/>
+      <w:lvlText w:val=""/>
+      <w:lvlJc w:val="left"/>
+      <w:pPr>
+        <w:ind w:left="5040" w:hanging="360"/>
+      </w:pPr>
+      <w:rPr>
+        <w:rFonts w:ascii="Symbol" w:hAnsi="Symbol" w:hint="default"/>
+      </w:rPr>
+    </w:lvl>
+    <w:lvl w:ilvl="7" w:tplc="040C0003" w:tentative="1">
+      <w:start w:val="1"/>
+      <w:numFmt w:val="bullet"/>
+      <w:lvlText w:val="o"/>
+      <w:lvlJc w:val="left"/>
+      <w:pPr>
+        <w:ind w:left="5760" w:hanging="360"/>
+      </w:pPr>
+      <w:rPr>
+        <w:rFonts w:ascii="Courier New" w:hAnsi="Courier New" w:cs="Courier New" w:hint="default"/>
+      </w:rPr>
+    </w:lvl>
+    <w:lvl w:ilvl="8" w:tplc="040C0005" w:tentative="1">
+      <w:start w:val="1"/>
+      <w:numFmt w:val="bullet"/>
+      <w:lvlText w:val=""/>
+      <w:lvlJc w:val="left"/>
+      <w:pPr>
+        <w:ind w:left="6480" w:hanging="360"/>
+      </w:pPr>
+      <w:rPr>
+        <w:rFonts w:ascii="Wingdings" w:hAnsi="Wingdings" w:hint="default"/>
+      </w:rPr>
+    </w:lvl>
+  </w:abstractNum>
+  <w:abstractNum w:abstractNumId="4" w15:restartNumberingAfterBreak="0">
+    <w:nsid w:val="1EB41190"/>
+    <w:multiLevelType w:val="multilevel"/>
+    <w:tmpl w:val="CDCE1212"/>
+    <w:lvl w:ilvl="0">
+      <w:start w:val="1"/>
+      <w:numFmt w:val="bullet"/>
+      <w:lvlText w:val=""/>
+      <w:lvlJc w:val="left"/>
+      <w:pPr>
+        <w:tabs>
+          <w:tab w:val="num" w:pos="720"/>
+        </w:tabs>
+        <w:ind w:left="720" w:hanging="360"/>
+      </w:pPr>
+      <w:rPr>
+        <w:rFonts w:ascii="Symbol" w:hAnsi="Symbol" w:hint="default"/>
+        <w:sz w:val="20"/>
+      </w:rPr>
+    </w:lvl>
+    <w:lvl w:ilvl="1" w:tentative="1">
+      <w:start w:val="1"/>
+      <w:numFmt w:val="bullet"/>
+      <w:lvlText w:val="o"/>
+      <w:lvlJc w:val="left"/>
+      <w:pPr>
+        <w:tabs>
+          <w:tab w:val="num" w:pos="1440"/>
+        </w:tabs>
+        <w:ind w:left="1440" w:hanging="360"/>
+      </w:pPr>
+      <w:rPr>
+        <w:rFonts w:ascii="Courier New" w:hAnsi="Courier New" w:hint="default"/>
+        <w:sz w:val="20"/>
+      </w:rPr>
+    </w:lvl>
+    <w:lvl w:ilvl="2" w:tentative="1">
+      <w:start w:val="1"/>
+      <w:numFmt w:val="bullet"/>
+      <w:lvlText w:val=""/>
+      <w:lvlJc w:val="left"/>
+      <w:pPr>
+        <w:tabs>
+          <w:tab w:val="num" w:pos="2160"/>
+        </w:tabs>
+        <w:ind w:left="2160" w:hanging="360"/>
+      </w:pPr>
+      <w:rPr>
+        <w:rFonts w:ascii="Wingdings" w:hAnsi="Wingdings" w:hint="default"/>
+        <w:sz w:val="20"/>
+      </w:rPr>
+    </w:lvl>
+    <w:lvl w:ilvl="3" w:tentative="1">
+      <w:start w:val="1"/>
+      <w:numFmt w:val="bullet"/>
+      <w:lvlText w:val=""/>
+      <w:lvlJc w:val="left"/>
+      <w:pPr>
+        <w:tabs>
+          <w:tab w:val="num" w:pos="2880"/>
+        </w:tabs>
+        <w:ind w:left="2880" w:hanging="360"/>
+      </w:pPr>
+      <w:rPr>
+        <w:rFonts w:ascii="Wingdings" w:hAnsi="Wingdings" w:hint="default"/>
+        <w:sz w:val="20"/>
+      </w:rPr>
+    </w:lvl>
+    <w:lvl w:ilvl="4" w:tentative="1">
+      <w:start w:val="1"/>
+      <w:numFmt w:val="bullet"/>
+      <w:lvlText w:val=""/>
+      <w:lvlJc w:val="left"/>
+      <w:pPr>
+        <w:tabs>
+          <w:tab w:val="num" w:pos="3600"/>
+        </w:tabs>
+        <w:ind w:left="3600" w:hanging="360"/>
+      </w:pPr>
+      <w:rPr>
+        <w:rFonts w:ascii="Wingdings" w:hAnsi="Wingdings" w:hint="default"/>
+        <w:sz w:val="20"/>
+      </w:rPr>
+    </w:lvl>
+    <w:lvl w:ilvl="5" w:tentative="1">
+      <w:start w:val="1"/>
+      <w:numFmt w:val="bullet"/>
+      <w:lvlText w:val=""/>
+      <w:lvlJc w:val="left"/>
+      <w:pPr>
+        <w:tabs>
+          <w:tab w:val="num" w:pos="4320"/>
+        </w:tabs>
+        <w:ind w:left="4320" w:hanging="360"/>
+      </w:pPr>
+      <w:rPr>
+        <w:rFonts w:ascii="Wingdings" w:hAnsi="Wingdings" w:hint="default"/>
+        <w:sz w:val="20"/>
+      </w:rPr>
+    </w:lvl>
+    <w:lvl w:ilvl="6" w:tentative="1">
+      <w:start w:val="1"/>
+      <w:numFmt w:val="bullet"/>
+      <w:lvlText w:val=""/>
+      <w:lvlJc w:val="left"/>
+      <w:pPr>
+        <w:tabs>
+          <w:tab w:val="num" w:pos="5040"/>
+        </w:tabs>
+        <w:ind w:left="5040" w:hanging="360"/>
+      </w:pPr>
+      <w:rPr>
+        <w:rFonts w:ascii="Wingdings" w:hAnsi="Wingdings" w:hint="default"/>
+        <w:sz w:val="20"/>
+      </w:rPr>
+    </w:lvl>
+    <w:lvl w:ilvl="7" w:tentative="1">
+      <w:start w:val="1"/>
+      <w:numFmt w:val="bullet"/>
+      <w:lvlText w:val=""/>
+      <w:lvlJc w:val="left"/>
+      <w:pPr>
+        <w:tabs>
+          <w:tab w:val="num" w:pos="5760"/>
+        </w:tabs>
+        <w:ind w:left="5760" w:hanging="360"/>
+      </w:pPr>
+      <w:rPr>
+        <w:rFonts w:ascii="Wingdings" w:hAnsi="Wingdings" w:hint="default"/>
+        <w:sz w:val="20"/>
+      </w:rPr>
+    </w:lvl>
+    <w:lvl w:ilvl="8" w:tentative="1">
+      <w:start w:val="1"/>
+      <w:numFmt w:val="bullet"/>
+      <w:lvlText w:val=""/>
+      <w:lvlJc w:val="left"/>
+      <w:pPr>
+        <w:tabs>
+          <w:tab w:val="num" w:pos="6480"/>
+        </w:tabs>
+        <w:ind w:left="6480" w:hanging="360"/>
+      </w:pPr>
+      <w:rPr>
+        <w:rFonts w:ascii="Wingdings" w:hAnsi="Wingdings" w:hint="default"/>
+        <w:sz w:val="20"/>
+      </w:rPr>
+    </w:lvl>
+  </w:abstractNum>
+  <w:abstractNum w:abstractNumId="5" w15:restartNumberingAfterBreak="0">
+    <w:nsid w:val="2FA04ED5"/>
+    <w:multiLevelType w:val="hybridMultilevel"/>
+    <w:tmpl w:val="8B40A104"/>
+    <w:lvl w:ilvl="0" w:tplc="1DE8CC48">
+      <w:start w:val="1"/>
+      <w:numFmt w:val="bullet"/>
+      <w:lvlText w:val="-"/>
+      <w:lvlJc w:val="left"/>
+      <w:pPr>
+        <w:ind w:left="720" w:hanging="360"/>
+      </w:pPr>
+      <w:rPr>
+        <w:rFonts w:ascii="Aptos" w:eastAsiaTheme="minorHAnsi" w:hAnsi="Aptos" w:cstheme="minorBidi" w:hint="default"/>
+      </w:rPr>
+    </w:lvl>
+    <w:lvl w:ilvl="1" w:tplc="040C0003" w:tentative="1">
+      <w:start w:val="1"/>
+      <w:numFmt w:val="bullet"/>
+      <w:lvlText w:val="o"/>
+      <w:lvlJc w:val="left"/>
+      <w:pPr>
+        <w:ind w:left="1440" w:hanging="360"/>
+      </w:pPr>
+      <w:rPr>
+        <w:rFonts w:ascii="Courier New" w:hAnsi="Courier New" w:cs="Courier New" w:hint="default"/>
+      </w:rPr>
+    </w:lvl>
+    <w:lvl w:ilvl="2" w:tplc="040C0005" w:tentative="1">
+      <w:start w:val="1"/>
+      <w:numFmt w:val="bullet"/>
+      <w:lvlText w:val=""/>
+      <w:lvlJc w:val="left"/>
+      <w:pPr>
+        <w:ind w:left="2160" w:hanging="360"/>
+      </w:pPr>
+      <w:rPr>
+        <w:rFonts w:ascii="Wingdings" w:hAnsi="Wingdings" w:hint="default"/>
+      </w:rPr>
+    </w:lvl>
+    <w:lvl w:ilvl="3" w:tplc="040C0001" w:tentative="1">
+      <w:start w:val="1"/>
+      <w:numFmt w:val="bullet"/>
+      <w:lvlText w:val=""/>
+      <w:lvlJc w:val="left"/>
+      <w:pPr>
+        <w:ind w:left="2880" w:hanging="360"/>
+      </w:pPr>
+      <w:rPr>
+        <w:rFonts w:ascii="Symbol" w:hAnsi="Symbol" w:hint="default"/>
+      </w:rPr>
+    </w:lvl>
+    <w:lvl w:ilvl="4" w:tplc="040C0003" w:tentative="1">
+      <w:start w:val="1"/>
+      <w:numFmt w:val="bullet"/>
+      <w:lvlText w:val="o"/>
+      <w:lvlJc w:val="left"/>
+      <w:pPr>
+        <w:ind w:left="3600" w:hanging="360"/>
+      </w:pPr>
+      <w:rPr>
+        <w:rFonts w:ascii="Courier New" w:hAnsi="Courier New" w:cs="Courier New" w:hint="default"/>
+      </w:rPr>
+    </w:lvl>
+    <w:lvl w:ilvl="5" w:tplc="040C0005" w:tentative="1">
+      <w:start w:val="1"/>
+      <w:numFmt w:val="bullet"/>
+      <w:lvlText w:val=""/>
+      <w:lvlJc w:val="left"/>
+      <w:pPr>
+        <w:ind w:left="4320" w:hanging="360"/>
+      </w:pPr>
+      <w:rPr>
+        <w:rFonts w:ascii="Wingdings" w:hAnsi="Wingdings" w:hint="default"/>
+      </w:rPr>
+    </w:lvl>
+    <w:lvl w:ilvl="6" w:tplc="040C0001" w:tentative="1">
+      <w:start w:val="1"/>
+      <w:numFmt w:val="bullet"/>
+      <w:lvlText w:val=""/>
+      <w:lvlJc w:val="left"/>
+      <w:pPr>
+        <w:ind w:left="5040" w:hanging="360"/>
+      </w:pPr>
+      <w:rPr>
+        <w:rFonts w:ascii="Symbol" w:hAnsi="Symbol" w:hint="default"/>
+      </w:rPr>
+    </w:lvl>
+    <w:lvl w:ilvl="7" w:tplc="040C0003" w:tentative="1">
+      <w:start w:val="1"/>
+      <w:numFmt w:val="bullet"/>
+      <w:lvlText w:val="o"/>
+      <w:lvlJc w:val="left"/>
+      <w:pPr>
+        <w:ind w:left="5760" w:hanging="360"/>
+      </w:pPr>
+      <w:rPr>
+        <w:rFonts w:ascii="Courier New" w:hAnsi="Courier New" w:cs="Courier New" w:hint="default"/>
+      </w:rPr>
+    </w:lvl>
+    <w:lvl w:ilvl="8" w:tplc="040C0005" w:tentative="1">
+      <w:start w:val="1"/>
+      <w:numFmt w:val="bullet"/>
+      <w:lvlText w:val=""/>
+      <w:lvlJc w:val="left"/>
+      <w:pPr>
+        <w:ind w:left="6480" w:hanging="360"/>
+      </w:pPr>
+      <w:rPr>
+        <w:rFonts w:ascii="Wingdings" w:hAnsi="Wingdings" w:hint="default"/>
+      </w:rPr>
+    </w:lvl>
+  </w:abstractNum>
+  <w:abstractNum w:abstractNumId="6" w15:restartNumberingAfterBreak="0">
+    <w:nsid w:val="39DF4D76"/>
+    <w:multiLevelType w:val="hybridMultilevel"/>
+    <w:tmpl w:val="BF163736"/>
+    <w:lvl w:ilvl="0" w:tplc="D8C0BA76">
+      <w:start w:val="1"/>
+      <w:numFmt w:val="bullet"/>
+      <w:lvlText w:val="-"/>
+      <w:lvlJc w:val="left"/>
+      <w:pPr>
+        <w:ind w:left="720" w:hanging="360"/>
+      </w:pPr>
+      <w:rPr>
+        <w:rFonts w:ascii="Aptos" w:eastAsiaTheme="minorHAnsi" w:hAnsi="Aptos" w:cstheme="minorBidi" w:hint="default"/>
+      </w:rPr>
+    </w:lvl>
+    <w:lvl w:ilvl="1" w:tplc="040C0003">
+      <w:start w:val="1"/>
+      <w:numFmt w:val="bullet"/>
+      <w:lvlText w:val="o"/>
+      <w:lvlJc w:val="left"/>
+      <w:pPr>
+        <w:ind w:left="1440" w:hanging="360"/>
+      </w:pPr>
+      <w:rPr>
+        <w:rFonts w:ascii="Courier New" w:hAnsi="Courier New" w:cs="Courier New" w:hint="default"/>
+      </w:rPr>
+    </w:lvl>
+    <w:lvl w:ilvl="2" w:tplc="040C0005" w:tentative="1">
+      <w:start w:val="1"/>
+      <w:numFmt w:val="bullet"/>
+      <w:lvlText w:val=""/>
+      <w:lvlJc w:val="left"/>
+      <w:pPr>
+        <w:ind w:left="2160" w:hanging="360"/>
+      </w:pPr>
+      <w:rPr>
+        <w:rFonts w:ascii="Wingdings" w:hAnsi="Wingdings" w:hint="default"/>
+      </w:rPr>
+    </w:lvl>
+    <w:lvl w:ilvl="3" w:tplc="040C0001" w:tentative="1">
+      <w:start w:val="1"/>
+      <w:numFmt w:val="bullet"/>
+      <w:lvlText w:val=""/>
+      <w:lvlJc w:val="left"/>
+      <w:pPr>
+        <w:ind w:left="2880" w:hanging="360"/>
+      </w:pPr>
+      <w:rPr>
+        <w:rFonts w:ascii="Symbol" w:hAnsi="Symbol" w:hint="default"/>
+      </w:rPr>
+    </w:lvl>
+    <w:lvl w:ilvl="4" w:tplc="040C0003" w:tentative="1">
+      <w:start w:val="1"/>
+      <w:numFmt w:val="bullet"/>
+      <w:lvlText w:val="o"/>
+      <w:lvlJc w:val="left"/>
+      <w:pPr>
+        <w:ind w:left="3600" w:hanging="360"/>
+      </w:pPr>
+      <w:rPr>
+        <w:rFonts w:ascii="Courier New" w:hAnsi="Courier New" w:cs="Courier New" w:hint="default"/>
+      </w:rPr>
+    </w:lvl>
+    <w:lvl w:ilvl="5" w:tplc="040C0005" w:tentative="1">
+      <w:start w:val="1"/>
+      <w:numFmt w:val="bullet"/>
+      <w:lvlText w:val=""/>
+      <w:lvlJc w:val="left"/>
+      <w:pPr>
+        <w:ind w:left="4320" w:hanging="360"/>
+      </w:pPr>
+      <w:rPr>
+        <w:rFonts w:ascii="Wingdings" w:hAnsi="Wingdings" w:hint="default"/>
+      </w:rPr>
+    </w:lvl>
+    <w:lvl w:ilvl="6" w:tplc="040C0001" w:tentative="1">
+      <w:start w:val="1"/>
+      <w:numFmt w:val="bullet"/>
+      <w:lvlText w:val=""/>
+      <w:lvlJc w:val="left"/>
+      <w:pPr>
+        <w:ind w:left="5040" w:hanging="360"/>
+      </w:pPr>
+      <w:rPr>
+        <w:rFonts w:ascii="Symbol" w:hAnsi="Symbol" w:hint="default"/>
+      </w:rPr>
+    </w:lvl>
+    <w:lvl w:ilvl="7" w:tplc="040C0003" w:tentative="1">
+      <w:start w:val="1"/>
+      <w:numFmt w:val="bullet"/>
+      <w:lvlText w:val="o"/>
+      <w:lvlJc w:val="left"/>
+      <w:pPr>
+        <w:ind w:left="5760" w:hanging="360"/>
+      </w:pPr>
+      <w:rPr>
+        <w:rFonts w:ascii="Courier New" w:hAnsi="Courier New" w:cs="Courier New" w:hint="default"/>
+      </w:rPr>
+    </w:lvl>
+    <w:lvl w:ilvl="8" w:tplc="040C0005" w:tentative="1">
+      <w:start w:val="1"/>
+      <w:numFmt w:val="bullet"/>
+      <w:lvlText w:val=""/>
+      <w:lvlJc w:val="left"/>
+      <w:pPr>
+        <w:ind w:left="6480" w:hanging="360"/>
+      </w:pPr>
+      <w:rPr>
+        <w:rFonts w:ascii="Wingdings" w:hAnsi="Wingdings" w:hint="default"/>
+      </w:rPr>
+    </w:lvl>
+  </w:abstractNum>
+  <w:abstractNum w:abstractNumId="7" w15:restartNumberingAfterBreak="0">
+    <w:nsid w:val="3ECB2FEC"/>
+    <w:multiLevelType w:val="hybridMultilevel"/>
+    <w:tmpl w:val="F37EB848"/>
+    <w:lvl w:ilvl="0" w:tplc="61F4620C">
+      <w:start w:val="1"/>
+      <w:numFmt w:val="bullet"/>
+      <w:lvlText w:val="-"/>
+      <w:lvlJc w:val="left"/>
+      <w:pPr>
+        <w:ind w:left="720" w:hanging="360"/>
+      </w:pPr>
+      <w:rPr>
+        <w:rFonts w:ascii="Aptos" w:eastAsiaTheme="minorHAnsi" w:hAnsi="Aptos" w:cstheme="minorBidi" w:hint="default"/>
+      </w:rPr>
+    </w:lvl>
+    <w:lvl w:ilvl="1" w:tplc="040C0003" w:tentative="1">
+      <w:start w:val="1"/>
+      <w:numFmt w:val="bullet"/>
+      <w:lvlText w:val="o"/>
+      <w:lvlJc w:val="left"/>
+      <w:pPr>
+        <w:ind w:left="1440" w:hanging="360"/>
+      </w:pPr>
+      <w:rPr>
+        <w:rFonts w:ascii="Courier New" w:hAnsi="Courier New" w:cs="Courier New" w:hint="default"/>
+      </w:rPr>
+    </w:lvl>
+    <w:lvl w:ilvl="2" w:tplc="040C0005" w:tentative="1">
+      <w:start w:val="1"/>
+      <w:numFmt w:val="bullet"/>
+      <w:lvlText w:val=""/>
+      <w:lvlJc w:val="left"/>
+      <w:pPr>
+        <w:ind w:left="2160" w:hanging="360"/>
+      </w:pPr>
+      <w:rPr>
+        <w:rFonts w:ascii="Wingdings" w:hAnsi="Wingdings" w:hint="default"/>
+      </w:rPr>
+    </w:lvl>
+    <w:lvl w:ilvl="3" w:tplc="040C0001" w:tentative="1">
+      <w:start w:val="1"/>
+      <w:numFmt w:val="bullet"/>
+      <w:lvlText w:val=""/>
+      <w:lvlJc w:val="left"/>
+      <w:pPr>
+        <w:ind w:left="2880" w:hanging="360"/>
+      </w:pPr>
+      <w:rPr>
+        <w:rFonts w:ascii="Symbol" w:hAnsi="Symbol" w:hint="default"/>
+      </w:rPr>
+    </w:lvl>
+    <w:lvl w:ilvl="4" w:tplc="040C0003" w:tentative="1">
+      <w:start w:val="1"/>
+      <w:numFmt w:val="bullet"/>
+      <w:lvlText w:val="o"/>
+      <w:lvlJc w:val="left"/>
+      <w:pPr>
+        <w:ind w:left="3600" w:hanging="360"/>
+      </w:pPr>
+      <w:rPr>
+        <w:rFonts w:ascii="Courier New" w:hAnsi="Courier New" w:cs="Courier New" w:hint="default"/>
+      </w:rPr>
+    </w:lvl>
+    <w:lvl w:ilvl="5" w:tplc="040C0005" w:tentative="1">
+      <w:start w:val="1"/>
+      <w:numFmt w:val="bullet"/>
+      <w:lvlText w:val=""/>
+      <w:lvlJc w:val="left"/>
+      <w:pPr>
+        <w:ind w:left="4320" w:hanging="360"/>
+      </w:pPr>
+      <w:rPr>
+        <w:rFonts w:ascii="Wingdings" w:hAnsi="Wingdings" w:hint="default"/>
+      </w:rPr>
+    </w:lvl>
+    <w:lvl w:ilvl="6" w:tplc="040C0001" w:tentative="1">
+      <w:start w:val="1"/>
+      <w:numFmt w:val="bullet"/>
+      <w:lvlText w:val=""/>
+      <w:lvlJc w:val="left"/>
+      <w:pPr>
+        <w:ind w:left="5040" w:hanging="360"/>
+      </w:pPr>
+      <w:rPr>
+        <w:rFonts w:ascii="Symbol" w:hAnsi="Symbol" w:hint="default"/>
+      </w:rPr>
+    </w:lvl>
+    <w:lvl w:ilvl="7" w:tplc="040C0003" w:tentative="1">
+      <w:start w:val="1"/>
+      <w:numFmt w:val="bullet"/>
+      <w:lvlText w:val="o"/>
+      <w:lvlJc w:val="left"/>
+      <w:pPr>
+        <w:ind w:left="5760" w:hanging="360"/>
+      </w:pPr>
+      <w:rPr>
+        <w:rFonts w:ascii="Courier New" w:hAnsi="Courier New" w:cs="Courier New" w:hint="default"/>
+      </w:rPr>
+    </w:lvl>
+    <w:lvl w:ilvl="8" w:tplc="040C0005" w:tentative="1">
+      <w:start w:val="1"/>
+      <w:numFmt w:val="bullet"/>
+      <w:lvlText w:val=""/>
+      <w:lvlJc w:val="left"/>
+      <w:pPr>
+        <w:ind w:left="6480" w:hanging="360"/>
+      </w:pPr>
+      <w:rPr>
+        <w:rFonts w:ascii="Wingdings" w:hAnsi="Wingdings" w:hint="default"/>
+      </w:rPr>
+    </w:lvl>
+  </w:abstractNum>
+  <w:abstractNum w:abstractNumId="8" w15:restartNumberingAfterBreak="0">
+    <w:nsid w:val="485826D8"/>
+    <w:multiLevelType w:val="multilevel"/>
+    <w:tmpl w:val="ECDAFB14"/>
+    <w:lvl w:ilvl="0">
+      <w:start w:val="1"/>
+      <w:numFmt w:val="bullet"/>
+      <w:lvlText w:val=""/>
+      <w:lvlJc w:val="left"/>
+      <w:pPr>
+        <w:tabs>
+          <w:tab w:val="num" w:pos="720"/>
+        </w:tabs>
+        <w:ind w:left="720" w:hanging="360"/>
+      </w:pPr>
+      <w:rPr>
+        <w:rFonts w:ascii="Symbol" w:hAnsi="Symbol" w:hint="default"/>
+        <w:sz w:val="20"/>
+      </w:rPr>
+    </w:lvl>
+    <w:lvl w:ilvl="1" w:tentative="1">
+      <w:start w:val="1"/>
+      <w:numFmt w:val="bullet"/>
+      <w:lvlText w:val="o"/>
+      <w:lvlJc w:val="left"/>
+      <w:pPr>
+        <w:tabs>
+          <w:tab w:val="num" w:pos="1440"/>
+        </w:tabs>
+        <w:ind w:left="1440" w:hanging="360"/>
+      </w:pPr>
+      <w:rPr>
+        <w:rFonts w:ascii="Courier New" w:hAnsi="Courier New" w:hint="default"/>
+        <w:sz w:val="20"/>
+      </w:rPr>
+    </w:lvl>
+    <w:lvl w:ilvl="2" w:tentative="1">
+      <w:start w:val="1"/>
+      <w:numFmt w:val="bullet"/>
+      <w:lvlText w:val=""/>
+      <w:lvlJc w:val="left"/>
+      <w:pPr>
+        <w:tabs>
+          <w:tab w:val="num" w:pos="2160"/>
+        </w:tabs>
+        <w:ind w:left="2160" w:hanging="360"/>
+      </w:pPr>
+      <w:rPr>
+        <w:rFonts w:ascii="Wingdings" w:hAnsi="Wingdings" w:hint="default"/>
+        <w:sz w:val="20"/>
+      </w:rPr>
+    </w:lvl>
+    <w:lvl w:ilvl="3" w:tentative="1">
+      <w:start w:val="1"/>
+      <w:numFmt w:val="bullet"/>
+      <w:lvlText w:val=""/>
+      <w:lvlJc w:val="left"/>
+      <w:pPr>
+        <w:tabs>
+          <w:tab w:val="num" w:pos="2880"/>
+        </w:tabs>
+        <w:ind w:left="2880" w:hanging="360"/>
+      </w:pPr>
+      <w:rPr>
+        <w:rFonts w:ascii="Wingdings" w:hAnsi="Wingdings" w:hint="default"/>
+        <w:sz w:val="20"/>
+      </w:rPr>
+    </w:lvl>
+    <w:lvl w:ilvl="4" w:tentative="1">
+      <w:start w:val="1"/>
+      <w:numFmt w:val="bullet"/>
+      <w:lvlText w:val=""/>
+      <w:lvlJc w:val="left"/>
+      <w:pPr>
+        <w:tabs>
+          <w:tab w:val="num" w:pos="3600"/>
+        </w:tabs>
+        <w:ind w:left="3600" w:hanging="360"/>
+      </w:pPr>
+      <w:rPr>
+        <w:rFonts w:ascii="Wingdings" w:hAnsi="Wingdings" w:hint="default"/>
+        <w:sz w:val="20"/>
+      </w:rPr>
+    </w:lvl>
+    <w:lvl w:ilvl="5" w:tentative="1">
+      <w:start w:val="1"/>
+      <w:numFmt w:val="bullet"/>
+      <w:lvlText w:val=""/>
+      <w:lvlJc w:val="left"/>
+      <w:pPr>
+        <w:tabs>
+          <w:tab w:val="num" w:pos="4320"/>
+        </w:tabs>
+        <w:ind w:left="4320" w:hanging="360"/>
+      </w:pPr>
+      <w:rPr>
+        <w:rFonts w:ascii="Wingdings" w:hAnsi="Wingdings" w:hint="default"/>
+        <w:sz w:val="20"/>
+      </w:rPr>
+    </w:lvl>
+    <w:lvl w:ilvl="6" w:tentative="1">
+      <w:start w:val="1"/>
+      <w:numFmt w:val="bullet"/>
+      <w:lvlText w:val=""/>
+      <w:lvlJc w:val="left"/>
+      <w:pPr>
+        <w:tabs>
+          <w:tab w:val="num" w:pos="5040"/>
+        </w:tabs>
+        <w:ind w:left="5040" w:hanging="360"/>
+      </w:pPr>
+      <w:rPr>
+        <w:rFonts w:ascii="Wingdings" w:hAnsi="Wingdings" w:hint="default"/>
+        <w:sz w:val="20"/>
+      </w:rPr>
+    </w:lvl>
+    <w:lvl w:ilvl="7" w:tentative="1">
+      <w:start w:val="1"/>
+      <w:numFmt w:val="bullet"/>
+      <w:lvlText w:val=""/>
+      <w:lvlJc w:val="left"/>
+      <w:pPr>
+        <w:tabs>
+          <w:tab w:val="num" w:pos="5760"/>
+        </w:tabs>
+        <w:ind w:left="5760" w:hanging="360"/>
+      </w:pPr>
+      <w:rPr>
+        <w:rFonts w:ascii="Wingdings" w:hAnsi="Wingdings" w:hint="default"/>
+        <w:sz w:val="20"/>
+      </w:rPr>
+    </w:lvl>
+    <w:lvl w:ilvl="8" w:tentative="1">
+      <w:start w:val="1"/>
+      <w:numFmt w:val="bullet"/>
+      <w:lvlText w:val=""/>
+      <w:lvlJc w:val="left"/>
+      <w:pPr>
+        <w:tabs>
+          <w:tab w:val="num" w:pos="6480"/>
+        </w:tabs>
+        <w:ind w:left="6480" w:hanging="360"/>
+      </w:pPr>
+      <w:rPr>
+        <w:rFonts w:ascii="Wingdings" w:hAnsi="Wingdings" w:hint="default"/>
+        <w:sz w:val="20"/>
+      </w:rPr>
+    </w:lvl>
+  </w:abstractNum>
+  <w:abstractNum w:abstractNumId="9" w15:restartNumberingAfterBreak="0">
+    <w:nsid w:val="4DAA32D9"/>
+    <w:multiLevelType w:val="multilevel"/>
+    <w:tmpl w:val="E30E2B30"/>
+    <w:lvl w:ilvl="0">
+      <w:start w:val="1"/>
+      <w:numFmt w:val="bullet"/>
+      <w:lvlText w:val=""/>
+      <w:lvlJc w:val="left"/>
+      <w:pPr>
+        <w:tabs>
+          <w:tab w:val="num" w:pos="720"/>
+        </w:tabs>
+        <w:ind w:left="720" w:hanging="360"/>
+      </w:pPr>
+      <w:rPr>
+        <w:rFonts w:ascii="Symbol" w:hAnsi="Symbol" w:hint="default"/>
+        <w:sz w:val="20"/>
+      </w:rPr>
+    </w:lvl>
+    <w:lvl w:ilvl="1" w:tentative="1">
+      <w:start w:val="1"/>
+      <w:numFmt w:val="bullet"/>
+      <w:lvlText w:val="o"/>
+      <w:lvlJc w:val="left"/>
+      <w:pPr>
+        <w:tabs>
+          <w:tab w:val="num" w:pos="1440"/>
+        </w:tabs>
+        <w:ind w:left="1440" w:hanging="360"/>
+      </w:pPr>
+      <w:rPr>
+        <w:rFonts w:ascii="Courier New" w:hAnsi="Courier New" w:hint="default"/>
+        <w:sz w:val="20"/>
+      </w:rPr>
+    </w:lvl>
+    <w:lvl w:ilvl="2" w:tentative="1">
+      <w:start w:val="1"/>
+      <w:numFmt w:val="bullet"/>
+      <w:lvlText w:val=""/>
+      <w:lvlJc w:val="left"/>
+      <w:pPr>
+        <w:tabs>
+          <w:tab w:val="num" w:pos="2160"/>
+        </w:tabs>
+        <w:ind w:left="2160" w:hanging="360"/>
+      </w:pPr>
+      <w:rPr>
+        <w:rFonts w:ascii="Wingdings" w:hAnsi="Wingdings" w:hint="default"/>
+        <w:sz w:val="20"/>
+      </w:rPr>
+    </w:lvl>
+    <w:lvl w:ilvl="3" w:tentative="1">
+      <w:start w:val="1"/>
+      <w:numFmt w:val="bullet"/>
+      <w:lvlText w:val=""/>
+      <w:lvlJc w:val="left"/>
+      <w:pPr>
+        <w:tabs>
+          <w:tab w:val="num" w:pos="2880"/>
+        </w:tabs>
+        <w:ind w:left="2880" w:hanging="360"/>
+      </w:pPr>
+      <w:rPr>
+        <w:rFonts w:ascii="Wingdings" w:hAnsi="Wingdings" w:hint="default"/>
+        <w:sz w:val="20"/>
+      </w:rPr>
+    </w:lvl>
+    <w:lvl w:ilvl="4" w:tentative="1">
+      <w:start w:val="1"/>
+      <w:numFmt w:val="bullet"/>
+      <w:lvlText w:val=""/>
+      <w:lvlJc w:val="left"/>
+      <w:pPr>
+        <w:tabs>
+          <w:tab w:val="num" w:pos="3600"/>
+        </w:tabs>
+        <w:ind w:left="3600" w:hanging="360"/>
+      </w:pPr>
+      <w:rPr>
+        <w:rFonts w:ascii="Wingdings" w:hAnsi="Wingdings" w:hint="default"/>
+        <w:sz w:val="20"/>
+      </w:rPr>
+    </w:lvl>
+    <w:lvl w:ilvl="5" w:tentative="1">
+      <w:start w:val="1"/>
+      <w:numFmt w:val="bullet"/>
+      <w:lvlText w:val=""/>
+      <w:lvlJc w:val="left"/>
+      <w:pPr>
+        <w:tabs>
+          <w:tab w:val="num" w:pos="4320"/>
+        </w:tabs>
+        <w:ind w:left="4320" w:hanging="360"/>
+      </w:pPr>
+      <w:rPr>
+        <w:rFonts w:ascii="Wingdings" w:hAnsi="Wingdings" w:hint="default"/>
+        <w:sz w:val="20"/>
+      </w:rPr>
+    </w:lvl>
+    <w:lvl w:ilvl="6" w:tentative="1">
+      <w:start w:val="1"/>
+      <w:numFmt w:val="bullet"/>
+      <w:lvlText w:val=""/>
+      <w:lvlJc w:val="left"/>
+      <w:pPr>
+        <w:tabs>
+          <w:tab w:val="num" w:pos="5040"/>
+        </w:tabs>
+        <w:ind w:left="5040" w:hanging="360"/>
+      </w:pPr>
+      <w:rPr>
+        <w:rFonts w:ascii="Wingdings" w:hAnsi="Wingdings" w:hint="default"/>
+        <w:sz w:val="20"/>
+      </w:rPr>
+    </w:lvl>
+    <w:lvl w:ilvl="7" w:tentative="1">
+      <w:start w:val="1"/>
+      <w:numFmt w:val="bullet"/>
+      <w:lvlText w:val=""/>
+      <w:lvlJc w:val="left"/>
+      <w:pPr>
+        <w:tabs>
+          <w:tab w:val="num" w:pos="5760"/>
+        </w:tabs>
+        <w:ind w:left="5760" w:hanging="360"/>
+      </w:pPr>
+      <w:rPr>
+        <w:rFonts w:ascii="Wingdings" w:hAnsi="Wingdings" w:hint="default"/>
+        <w:sz w:val="20"/>
+      </w:rPr>
+    </w:lvl>
+    <w:lvl w:ilvl="8" w:tentative="1">
+      <w:start w:val="1"/>
+      <w:numFmt w:val="bullet"/>
+      <w:lvlText w:val=""/>
+      <w:lvlJc w:val="left"/>
+      <w:pPr>
+        <w:tabs>
+          <w:tab w:val="num" w:pos="6480"/>
+        </w:tabs>
+        <w:ind w:left="6480" w:hanging="360"/>
+      </w:pPr>
+      <w:rPr>
+        <w:rFonts w:ascii="Wingdings" w:hAnsi="Wingdings" w:hint="default"/>
+        <w:sz w:val="20"/>
+      </w:rPr>
+    </w:lvl>
+  </w:abstractNum>
+  <w:abstractNum w:abstractNumId="10" w15:restartNumberingAfterBreak="0">
+    <w:nsid w:val="4FE83068"/>
+    <w:multiLevelType w:val="multilevel"/>
+    <w:tmpl w:val="8DDEF3DA"/>
+    <w:lvl w:ilvl="0">
+      <w:start w:val="1"/>
+      <w:numFmt w:val="bullet"/>
+      <w:lvlText w:val=""/>
+      <w:lvlJc w:val="left"/>
+      <w:pPr>
+        <w:tabs>
+          <w:tab w:val="num" w:pos="720"/>
+        </w:tabs>
+        <w:ind w:left="720" w:hanging="360"/>
+      </w:pPr>
+      <w:rPr>
+        <w:rFonts w:ascii="Symbol" w:hAnsi="Symbol" w:hint="default"/>
+        <w:sz w:val="20"/>
+      </w:rPr>
+    </w:lvl>
+    <w:lvl w:ilvl="1" w:tentative="1">
+      <w:start w:val="1"/>
+      <w:numFmt w:val="bullet"/>
+      <w:lvlText w:val="o"/>
+      <w:lvlJc w:val="left"/>
+      <w:pPr>
+        <w:tabs>
+          <w:tab w:val="num" w:pos="1440"/>
+        </w:tabs>
+        <w:ind w:left="1440" w:hanging="360"/>
+      </w:pPr>
+      <w:rPr>
+        <w:rFonts w:ascii="Courier New" w:hAnsi="Courier New" w:hint="default"/>
+        <w:sz w:val="20"/>
+      </w:rPr>
+    </w:lvl>
+    <w:lvl w:ilvl="2" w:tentative="1">
+      <w:start w:val="1"/>
+      <w:numFmt w:val="bullet"/>
+      <w:lvlText w:val=""/>
+      <w:lvlJc w:val="left"/>
+      <w:pPr>
+        <w:tabs>
+          <w:tab w:val="num" w:pos="2160"/>
+        </w:tabs>
+        <w:ind w:left="2160" w:hanging="360"/>
+      </w:pPr>
+      <w:rPr>
+        <w:rFonts w:ascii="Wingdings" w:hAnsi="Wingdings" w:hint="default"/>
+        <w:sz w:val="20"/>
+      </w:rPr>
+    </w:lvl>
+    <w:lvl w:ilvl="3" w:tentative="1">
+      <w:start w:val="1"/>
+      <w:numFmt w:val="bullet"/>
+      <w:lvlText w:val=""/>
+      <w:lvlJc w:val="left"/>
+      <w:pPr>
+        <w:tabs>
+          <w:tab w:val="num" w:pos="2880"/>
+        </w:tabs>
+        <w:ind w:left="2880" w:hanging="360"/>
+      </w:pPr>
+      <w:rPr>
+        <w:rFonts w:ascii="Wingdings" w:hAnsi="Wingdings" w:hint="default"/>
+        <w:sz w:val="20"/>
+      </w:rPr>
+    </w:lvl>
+    <w:lvl w:ilvl="4" w:tentative="1">
+      <w:start w:val="1"/>
+      <w:numFmt w:val="bullet"/>
+      <w:lvlText w:val=""/>
+      <w:lvlJc w:val="left"/>
+      <w:pPr>
+        <w:tabs>
+          <w:tab w:val="num" w:pos="3600"/>
+        </w:tabs>
+        <w:ind w:left="3600" w:hanging="360"/>
+      </w:pPr>
+      <w:rPr>
+        <w:rFonts w:ascii="Wingdings" w:hAnsi="Wingdings" w:hint="default"/>
+        <w:sz w:val="20"/>
+      </w:rPr>
+    </w:lvl>
+    <w:lvl w:ilvl="5" w:tentative="1">
+      <w:start w:val="1"/>
+      <w:numFmt w:val="bullet"/>
+      <w:lvlText w:val=""/>
+      <w:lvlJc w:val="left"/>
+      <w:pPr>
+        <w:tabs>
+          <w:tab w:val="num" w:pos="4320"/>
+        </w:tabs>
+        <w:ind w:left="4320" w:hanging="360"/>
+      </w:pPr>
+      <w:rPr>
+        <w:rFonts w:ascii="Wingdings" w:hAnsi="Wingdings" w:hint="default"/>
+        <w:sz w:val="20"/>
+      </w:rPr>
+    </w:lvl>
+    <w:lvl w:ilvl="6" w:tentative="1">
+      <w:start w:val="1"/>
+      <w:numFmt w:val="bullet"/>
+      <w:lvlText w:val=""/>
+      <w:lvlJc w:val="left"/>
+      <w:pPr>
+        <w:tabs>
+          <w:tab w:val="num" w:pos="5040"/>
+        </w:tabs>
+        <w:ind w:left="5040" w:hanging="360"/>
+      </w:pPr>
+      <w:rPr>
+        <w:rFonts w:ascii="Wingdings" w:hAnsi="Wingdings" w:hint="default"/>
+        <w:sz w:val="20"/>
+      </w:rPr>
+    </w:lvl>
+    <w:lvl w:ilvl="7" w:tentative="1">
+      <w:start w:val="1"/>
+      <w:numFmt w:val="bullet"/>
+      <w:lvlText w:val=""/>
+      <w:lvlJc w:val="left"/>
+      <w:pPr>
+        <w:tabs>
+          <w:tab w:val="num" w:pos="5760"/>
+        </w:tabs>
+        <w:ind w:left="5760" w:hanging="360"/>
+      </w:pPr>
+      <w:rPr>
+        <w:rFonts w:ascii="Wingdings" w:hAnsi="Wingdings" w:hint="default"/>
+        <w:sz w:val="20"/>
+      </w:rPr>
+    </w:lvl>
+    <w:lvl w:ilvl="8" w:tentative="1">
+      <w:start w:val="1"/>
+      <w:numFmt w:val="bullet"/>
+      <w:lvlText w:val=""/>
+      <w:lvlJc w:val="left"/>
+      <w:pPr>
+        <w:tabs>
+          <w:tab w:val="num" w:pos="6480"/>
+        </w:tabs>
+        <w:ind w:left="6480" w:hanging="360"/>
+      </w:pPr>
+      <w:rPr>
+        <w:rFonts w:ascii="Wingdings" w:hAnsi="Wingdings" w:hint="default"/>
+        <w:sz w:val="20"/>
+      </w:rPr>
+    </w:lvl>
+  </w:abstractNum>
+  <w:abstractNum w:abstractNumId="11" w15:restartNumberingAfterBreak="0">
+    <w:nsid w:val="627B4EE4"/>
+    <w:multiLevelType w:val="multilevel"/>
+    <w:tmpl w:val="A3C436B2"/>
+    <w:lvl w:ilvl="0">
+      <w:start w:val="1"/>
+      <w:numFmt w:val="bullet"/>
+      <w:lvlText w:val=""/>
+      <w:lvlJc w:val="left"/>
+      <w:pPr>
+        <w:tabs>
+          <w:tab w:val="num" w:pos="720"/>
+        </w:tabs>
+        <w:ind w:left="720" w:hanging="360"/>
+      </w:pPr>
+      <w:rPr>
+        <w:rFonts w:ascii="Symbol" w:hAnsi="Symbol" w:hint="default"/>
+        <w:sz w:val="20"/>
+      </w:rPr>
+    </w:lvl>
+    <w:lvl w:ilvl="1" w:tentative="1">
+      <w:start w:val="1"/>
+      <w:numFmt w:val="bullet"/>
+      <w:lvlText w:val="o"/>
+      <w:lvlJc w:val="left"/>
+      <w:pPr>
+        <w:tabs>
+          <w:tab w:val="num" w:pos="1440"/>
+        </w:tabs>
+        <w:ind w:left="1440" w:hanging="360"/>
+      </w:pPr>
+      <w:rPr>
+        <w:rFonts w:ascii="Courier New" w:hAnsi="Courier New" w:hint="default"/>
+        <w:sz w:val="20"/>
+      </w:rPr>
+    </w:lvl>
+    <w:lvl w:ilvl="2" w:tentative="1">
+      <w:start w:val="1"/>
+      <w:numFmt w:val="bullet"/>
+      <w:lvlText w:val=""/>
+      <w:lvlJc w:val="left"/>
+      <w:pPr>
+        <w:tabs>
+          <w:tab w:val="num" w:pos="2160"/>
+        </w:tabs>
+        <w:ind w:left="2160" w:hanging="360"/>
+      </w:pPr>
+      <w:rPr>
+        <w:rFonts w:ascii="Wingdings" w:hAnsi="Wingdings" w:hint="default"/>
+        <w:sz w:val="20"/>
+      </w:rPr>
+    </w:lvl>
+    <w:lvl w:ilvl="3" w:tentative="1">
+      <w:start w:val="1"/>
+      <w:numFmt w:val="bullet"/>
+      <w:lvlText w:val=""/>
+      <w:lvlJc w:val="left"/>
+      <w:pPr>
+        <w:tabs>
+          <w:tab w:val="num" w:pos="2880"/>
+        </w:tabs>
+        <w:ind w:left="2880" w:hanging="360"/>
+      </w:pPr>
+      <w:rPr>
+        <w:rFonts w:ascii="Wingdings" w:hAnsi="Wingdings" w:hint="default"/>
+        <w:sz w:val="20"/>
+      </w:rPr>
+    </w:lvl>
+    <w:lvl w:ilvl="4" w:tentative="1">
+      <w:start w:val="1"/>
+      <w:numFmt w:val="bullet"/>
+      <w:lvlText w:val=""/>
+      <w:lvlJc w:val="left"/>
+      <w:pPr>
+        <w:tabs>
+          <w:tab w:val="num" w:pos="3600"/>
+        </w:tabs>
+        <w:ind w:left="3600" w:hanging="360"/>
+      </w:pPr>
+      <w:rPr>
+        <w:rFonts w:ascii="Wingdings" w:hAnsi="Wingdings" w:hint="default"/>
+        <w:sz w:val="20"/>
+      </w:rPr>
+    </w:lvl>
+    <w:lvl w:ilvl="5" w:tentative="1">
+      <w:start w:val="1"/>
+      <w:numFmt w:val="bullet"/>
+      <w:lvlText w:val=""/>
+      <w:lvlJc w:val="left"/>
+      <w:pPr>
+        <w:tabs>
+          <w:tab w:val="num" w:pos="4320"/>
+        </w:tabs>
+        <w:ind w:left="4320" w:hanging="360"/>
+      </w:pPr>
+      <w:rPr>
+        <w:rFonts w:ascii="Wingdings" w:hAnsi="Wingdings" w:hint="default"/>
+        <w:sz w:val="20"/>
+      </w:rPr>
+    </w:lvl>
+    <w:lvl w:ilvl="6" w:tentative="1">
+      <w:start w:val="1"/>
+      <w:numFmt w:val="bullet"/>
+      <w:lvlText w:val=""/>
+      <w:lvlJc w:val="left"/>
+      <w:pPr>
+        <w:tabs>
+          <w:tab w:val="num" w:pos="5040"/>
+        </w:tabs>
+        <w:ind w:left="5040" w:hanging="360"/>
+      </w:pPr>
+      <w:rPr>
+        <w:rFonts w:ascii="Wingdings" w:hAnsi="Wingdings" w:hint="default"/>
+        <w:sz w:val="20"/>
+      </w:rPr>
+    </w:lvl>
+    <w:lvl w:ilvl="7" w:tentative="1">
+      <w:start w:val="1"/>
+      <w:numFmt w:val="bullet"/>
+      <w:lvlText w:val=""/>
+      <w:lvlJc w:val="left"/>
+      <w:pPr>
+        <w:tabs>
+          <w:tab w:val="num" w:pos="5760"/>
+        </w:tabs>
+        <w:ind w:left="5760" w:hanging="360"/>
+      </w:pPr>
+      <w:rPr>
+        <w:rFonts w:ascii="Wingdings" w:hAnsi="Wingdings" w:hint="default"/>
+        <w:sz w:val="20"/>
+      </w:rPr>
+    </w:lvl>
+    <w:lvl w:ilvl="8" w:tentative="1">
+      <w:start w:val="1"/>
+      <w:numFmt w:val="bullet"/>
+      <w:lvlText w:val=""/>
+      <w:lvlJc w:val="left"/>
+      <w:pPr>
+        <w:tabs>
+          <w:tab w:val="num" w:pos="6480"/>
+        </w:tabs>
+        <w:ind w:left="6480" w:hanging="360"/>
+      </w:pPr>
+      <w:rPr>
+        <w:rFonts w:ascii="Wingdings" w:hAnsi="Wingdings" w:hint="default"/>
+        <w:sz w:val="20"/>
+      </w:rPr>
+    </w:lvl>
+  </w:abstractNum>
+  <w:abstractNum w:abstractNumId="12" w15:restartNumberingAfterBreak="0">
     <w:nsid w:val="62F2330E"/>
     <w:multiLevelType w:val="multilevel"/>
     <w:tmpl w:val="C612567A"/>
@@ -4617,7 +8476,270 @@
       </w:rPr>
     </w:lvl>
   </w:abstractNum>
-  <w:abstractNum w:abstractNumId="1" w15:restartNumberingAfterBreak="0">
+  <w:abstractNum w:abstractNumId="13" w15:restartNumberingAfterBreak="0">
+    <w:nsid w:val="643F1D2F"/>
+    <w:multiLevelType w:val="hybridMultilevel"/>
+    <w:tmpl w:val="0C88FFB6"/>
+    <w:lvl w:ilvl="0" w:tplc="A70CF9B4">
+      <w:start w:val="1"/>
+      <w:numFmt w:val="bullet"/>
+      <w:lvlText w:val="-"/>
+      <w:lvlJc w:val="left"/>
+      <w:pPr>
+        <w:ind w:left="720" w:hanging="360"/>
+      </w:pPr>
+      <w:rPr>
+        <w:rFonts w:ascii="Aptos" w:eastAsiaTheme="minorHAnsi" w:hAnsi="Aptos" w:cstheme="minorBidi" w:hint="default"/>
+        <w:i/>
+      </w:rPr>
+    </w:lvl>
+    <w:lvl w:ilvl="1" w:tplc="040C0003" w:tentative="1">
+      <w:start w:val="1"/>
+      <w:numFmt w:val="bullet"/>
+      <w:lvlText w:val="o"/>
+      <w:lvlJc w:val="left"/>
+      <w:pPr>
+        <w:ind w:left="1440" w:hanging="360"/>
+      </w:pPr>
+      <w:rPr>
+        <w:rFonts w:ascii="Courier New" w:hAnsi="Courier New" w:cs="Courier New" w:hint="default"/>
+      </w:rPr>
+    </w:lvl>
+    <w:lvl w:ilvl="2" w:tplc="040C0005" w:tentative="1">
+      <w:start w:val="1"/>
+      <w:numFmt w:val="bullet"/>
+      <w:lvlText w:val=""/>
+      <w:lvlJc w:val="left"/>
+      <w:pPr>
+        <w:ind w:left="2160" w:hanging="360"/>
+      </w:pPr>
+      <w:rPr>
+        <w:rFonts w:ascii="Wingdings" w:hAnsi="Wingdings" w:hint="default"/>
+      </w:rPr>
+    </w:lvl>
+    <w:lvl w:ilvl="3" w:tplc="040C0001" w:tentative="1">
+      <w:start w:val="1"/>
+      <w:numFmt w:val="bullet"/>
+      <w:lvlText w:val=""/>
+      <w:lvlJc w:val="left"/>
+      <w:pPr>
+        <w:ind w:left="2880" w:hanging="360"/>
+      </w:pPr>
+      <w:rPr>
+        <w:rFonts w:ascii="Symbol" w:hAnsi="Symbol" w:hint="default"/>
+      </w:rPr>
+    </w:lvl>
+    <w:lvl w:ilvl="4" w:tplc="040C0003" w:tentative="1">
+      <w:start w:val="1"/>
+      <w:numFmt w:val="bullet"/>
+      <w:lvlText w:val="o"/>
+      <w:lvlJc w:val="left"/>
+      <w:pPr>
+        <w:ind w:left="3600" w:hanging="360"/>
+      </w:pPr>
+      <w:rPr>
+        <w:rFonts w:ascii="Courier New" w:hAnsi="Courier New" w:cs="Courier New" w:hint="default"/>
+      </w:rPr>
+    </w:lvl>
+    <w:lvl w:ilvl="5" w:tplc="040C0005" w:tentative="1">
+      <w:start w:val="1"/>
+      <w:numFmt w:val="bullet"/>
+      <w:lvlText w:val=""/>
+      <w:lvlJc w:val="left"/>
+      <w:pPr>
+        <w:ind w:left="4320" w:hanging="360"/>
+      </w:pPr>
+      <w:rPr>
+        <w:rFonts w:ascii="Wingdings" w:hAnsi="Wingdings" w:hint="default"/>
+      </w:rPr>
+    </w:lvl>
+    <w:lvl w:ilvl="6" w:tplc="040C0001" w:tentative="1">
+      <w:start w:val="1"/>
+      <w:numFmt w:val="bullet"/>
+      <w:lvlText w:val=""/>
+      <w:lvlJc w:val="left"/>
+      <w:pPr>
+        <w:ind w:left="5040" w:hanging="360"/>
+      </w:pPr>
+      <w:rPr>
+        <w:rFonts w:ascii="Symbol" w:hAnsi="Symbol" w:hint="default"/>
+      </w:rPr>
+    </w:lvl>
+    <w:lvl w:ilvl="7" w:tplc="040C0003" w:tentative="1">
+      <w:start w:val="1"/>
+      <w:numFmt w:val="bullet"/>
+      <w:lvlText w:val="o"/>
+      <w:lvlJc w:val="left"/>
+      <w:pPr>
+        <w:ind w:left="5760" w:hanging="360"/>
+      </w:pPr>
+      <w:rPr>
+        <w:rFonts w:ascii="Courier New" w:hAnsi="Courier New" w:cs="Courier New" w:hint="default"/>
+      </w:rPr>
+    </w:lvl>
+    <w:lvl w:ilvl="8" w:tplc="040C0005" w:tentative="1">
+      <w:start w:val="1"/>
+      <w:numFmt w:val="bullet"/>
+      <w:lvlText w:val=""/>
+      <w:lvlJc w:val="left"/>
+      <w:pPr>
+        <w:ind w:left="6480" w:hanging="360"/>
+      </w:pPr>
+      <w:rPr>
+        <w:rFonts w:ascii="Wingdings" w:hAnsi="Wingdings" w:hint="default"/>
+      </w:rPr>
+    </w:lvl>
+  </w:abstractNum>
+  <w:abstractNum w:abstractNumId="14" w15:restartNumberingAfterBreak="0">
+    <w:nsid w:val="6986098B"/>
+    <w:multiLevelType w:val="multilevel"/>
+    <w:tmpl w:val="97200C58"/>
+    <w:lvl w:ilvl="0">
+      <w:start w:val="1"/>
+      <w:numFmt w:val="bullet"/>
+      <w:lvlText w:val=""/>
+      <w:lvlJc w:val="left"/>
+      <w:pPr>
+        <w:tabs>
+          <w:tab w:val="num" w:pos="720"/>
+        </w:tabs>
+        <w:ind w:left="720" w:hanging="360"/>
+      </w:pPr>
+      <w:rPr>
+        <w:rFonts w:ascii="Symbol" w:hAnsi="Symbol" w:hint="default"/>
+        <w:sz w:val="20"/>
+      </w:rPr>
+    </w:lvl>
+    <w:lvl w:ilvl="1" w:tentative="1">
+      <w:start w:val="1"/>
+      <w:numFmt w:val="bullet"/>
+      <w:lvlText w:val="o"/>
+      <w:lvlJc w:val="left"/>
+      <w:pPr>
+        <w:tabs>
+          <w:tab w:val="num" w:pos="1440"/>
+        </w:tabs>
+        <w:ind w:left="1440" w:hanging="360"/>
+      </w:pPr>
+      <w:rPr>
+        <w:rFonts w:ascii="Courier New" w:hAnsi="Courier New" w:hint="default"/>
+        <w:sz w:val="20"/>
+      </w:rPr>
+    </w:lvl>
+    <w:lvl w:ilvl="2" w:tentative="1">
+      <w:start w:val="1"/>
+      <w:numFmt w:val="bullet"/>
+      <w:lvlText w:val=""/>
+      <w:lvlJc w:val="left"/>
+      <w:pPr>
+        <w:tabs>
+          <w:tab w:val="num" w:pos="2160"/>
+        </w:tabs>
+        <w:ind w:left="2160" w:hanging="360"/>
+      </w:pPr>
+      <w:rPr>
+        <w:rFonts w:ascii="Wingdings" w:hAnsi="Wingdings" w:hint="default"/>
+        <w:sz w:val="20"/>
+      </w:rPr>
+    </w:lvl>
+    <w:lvl w:ilvl="3" w:tentative="1">
+      <w:start w:val="1"/>
+      <w:numFmt w:val="bullet"/>
+      <w:lvlText w:val=""/>
+      <w:lvlJc w:val="left"/>
+      <w:pPr>
+        <w:tabs>
+          <w:tab w:val="num" w:pos="2880"/>
+        </w:tabs>
+        <w:ind w:left="2880" w:hanging="360"/>
+      </w:pPr>
+      <w:rPr>
+        <w:rFonts w:ascii="Wingdings" w:hAnsi="Wingdings" w:hint="default"/>
+        <w:sz w:val="20"/>
+      </w:rPr>
+    </w:lvl>
+    <w:lvl w:ilvl="4" w:tentative="1">
+      <w:start w:val="1"/>
+      <w:numFmt w:val="bullet"/>
+      <w:lvlText w:val=""/>
+      <w:lvlJc w:val="left"/>
+      <w:pPr>
+        <w:tabs>
+          <w:tab w:val="num" w:pos="3600"/>
+        </w:tabs>
+        <w:ind w:left="3600" w:hanging="360"/>
+      </w:pPr>
+      <w:rPr>
+        <w:rFonts w:ascii="Wingdings" w:hAnsi="Wingdings" w:hint="default"/>
+        <w:sz w:val="20"/>
+      </w:rPr>
+    </w:lvl>
+    <w:lvl w:ilvl="5" w:tentative="1">
+      <w:start w:val="1"/>
+      <w:numFmt w:val="bullet"/>
+      <w:lvlText w:val=""/>
+      <w:lvlJc w:val="left"/>
+      <w:pPr>
+        <w:tabs>
+          <w:tab w:val="num" w:pos="4320"/>
+        </w:tabs>
+        <w:ind w:left="4320" w:hanging="360"/>
+      </w:pPr>
+      <w:rPr>
+        <w:rFonts w:ascii="Wingdings" w:hAnsi="Wingdings" w:hint="default"/>
+        <w:sz w:val="20"/>
+      </w:rPr>
+    </w:lvl>
+    <w:lvl w:ilvl="6" w:tentative="1">
+      <w:start w:val="1"/>
+      <w:numFmt w:val="bullet"/>
+      <w:lvlText w:val=""/>
+      <w:lvlJc w:val="left"/>
+      <w:pPr>
+        <w:tabs>
+          <w:tab w:val="num" w:pos="5040"/>
+        </w:tabs>
+        <w:ind w:left="5040" w:hanging="360"/>
+      </w:pPr>
+      <w:rPr>
+        <w:rFonts w:ascii="Wingdings" w:hAnsi="Wingdings" w:hint="default"/>
+        <w:sz w:val="20"/>
+      </w:rPr>
+    </w:lvl>
+    <w:lvl w:ilvl="7" w:tentative="1">
+      <w:start w:val="1"/>
+      <w:numFmt w:val="bullet"/>
+      <w:lvlText w:val=""/>
+      <w:lvlJc w:val="left"/>
+      <w:pPr>
+        <w:tabs>
+          <w:tab w:val="num" w:pos="5760"/>
+        </w:tabs>
+        <w:ind w:left="5760" w:hanging="360"/>
+      </w:pPr>
+      <w:rPr>
+        <w:rFonts w:ascii="Wingdings" w:hAnsi="Wingdings" w:hint="default"/>
+        <w:sz w:val="20"/>
+      </w:rPr>
+    </w:lvl>
+    <w:lvl w:ilvl="8" w:tentative="1">
+      <w:start w:val="1"/>
+      <w:numFmt w:val="bullet"/>
+      <w:lvlText w:val=""/>
+      <w:lvlJc w:val="left"/>
+      <w:pPr>
+        <w:tabs>
+          <w:tab w:val="num" w:pos="6480"/>
+        </w:tabs>
+        <w:ind w:left="6480" w:hanging="360"/>
+      </w:pPr>
+      <w:rPr>
+        <w:rFonts w:ascii="Wingdings" w:hAnsi="Wingdings" w:hint="default"/>
+        <w:sz w:val="20"/>
+      </w:rPr>
+    </w:lvl>
+  </w:abstractNum>
+  <w:abstractNum w:abstractNumId="15" w15:restartNumberingAfterBreak="0">
     <w:nsid w:val="7FE006BF"/>
     <w:multiLevelType w:val="hybridMultilevel"/>
     <w:tmpl w:val="F9AA9AB6"/>
@@ -4731,10 +8853,52 @@
     </w:lvl>
   </w:abstractNum>
   <w:num w:numId="1" w16cid:durableId="1806267098">
+    <w:abstractNumId w:val="15"/>
+  </w:num>
+  <w:num w:numId="2" w16cid:durableId="2012298056">
+    <w:abstractNumId w:val="12"/>
+  </w:num>
+  <w:num w:numId="3" w16cid:durableId="981690241">
+    <w:abstractNumId w:val="2"/>
+  </w:num>
+  <w:num w:numId="4" w16cid:durableId="1141921347">
+    <w:abstractNumId w:val="4"/>
+  </w:num>
+  <w:num w:numId="5" w16cid:durableId="2007854356">
+    <w:abstractNumId w:val="0"/>
+  </w:num>
+  <w:num w:numId="6" w16cid:durableId="1693729440">
+    <w:abstractNumId w:val="14"/>
+  </w:num>
+  <w:num w:numId="7" w16cid:durableId="514539859">
+    <w:abstractNumId w:val="9"/>
+  </w:num>
+  <w:num w:numId="8" w16cid:durableId="1182663925">
+    <w:abstractNumId w:val="10"/>
+  </w:num>
+  <w:num w:numId="9" w16cid:durableId="2049378661">
+    <w:abstractNumId w:val="8"/>
+  </w:num>
+  <w:num w:numId="10" w16cid:durableId="834956867">
     <w:abstractNumId w:val="1"/>
   </w:num>
-  <w:num w:numId="2" w16cid:durableId="2012298056">
-    <w:abstractNumId w:val="0"/>
+  <w:num w:numId="11" w16cid:durableId="1697461431">
+    <w:abstractNumId w:val="11"/>
+  </w:num>
+  <w:num w:numId="12" w16cid:durableId="1823501011">
+    <w:abstractNumId w:val="3"/>
+  </w:num>
+  <w:num w:numId="13" w16cid:durableId="1111582434">
+    <w:abstractNumId w:val="7"/>
+  </w:num>
+  <w:num w:numId="14" w16cid:durableId="1666129493">
+    <w:abstractNumId w:val="6"/>
+  </w:num>
+  <w:num w:numId="15" w16cid:durableId="1629358762">
+    <w:abstractNumId w:val="13"/>
+  </w:num>
+  <w:num w:numId="16" w16cid:durableId="1729264211">
+    <w:abstractNumId w:val="5"/>
   </w:num>
 </w:numbering>
 </file>
@@ -5189,7 +9353,6 @@
     <w:next w:val="Normal"/>
     <w:link w:val="Titre3Car"/>
     <w:uiPriority w:val="9"/>
-    <w:semiHidden/>
     <w:unhideWhenUsed/>
     <w:qFormat/>
     <w:rsid w:val="00784DD9"/>
@@ -5395,7 +9558,6 @@
     <w:basedOn w:val="Policepardfaut"/>
     <w:link w:val="Titre3"/>
     <w:uiPriority w:val="9"/>
-    <w:semiHidden/>
     <w:rsid w:val="00784DD9"/>
     <w:rPr>
       <w:rFonts w:eastAsiaTheme="majorEastAsia" w:cstheme="majorBidi"/>
@@ -5696,6 +9858,119 @@
       <w:szCs w:val="22"/>
       <w:lang w:eastAsia="fr-FR"/>
       <w14:ligatures w14:val="none"/>
+    </w:rPr>
+  </w:style>
+  <w:style w:type="paragraph" w:styleId="En-tte">
+    <w:name w:val="header"/>
+    <w:basedOn w:val="Normal"/>
+    <w:link w:val="En-tteCar"/>
+    <w:uiPriority w:val="99"/>
+    <w:unhideWhenUsed/>
+    <w:rsid w:val="006128B6"/>
+    <w:pPr>
+      <w:tabs>
+        <w:tab w:val="center" w:pos="4536"/>
+        <w:tab w:val="right" w:pos="9072"/>
+      </w:tabs>
+      <w:spacing w:after="0" w:line="240" w:lineRule="auto"/>
+    </w:pPr>
+  </w:style>
+  <w:style w:type="character" w:customStyle="1" w:styleId="En-tteCar">
+    <w:name w:val="En-tête Car"/>
+    <w:basedOn w:val="Policepardfaut"/>
+    <w:link w:val="En-tte"/>
+    <w:uiPriority w:val="99"/>
+    <w:rsid w:val="006128B6"/>
+  </w:style>
+  <w:style w:type="paragraph" w:styleId="Pieddepage">
+    <w:name w:val="footer"/>
+    <w:basedOn w:val="Normal"/>
+    <w:link w:val="PieddepageCar"/>
+    <w:uiPriority w:val="99"/>
+    <w:unhideWhenUsed/>
+    <w:rsid w:val="006128B6"/>
+    <w:pPr>
+      <w:tabs>
+        <w:tab w:val="center" w:pos="4536"/>
+        <w:tab w:val="right" w:pos="9072"/>
+      </w:tabs>
+      <w:spacing w:after="0" w:line="240" w:lineRule="auto"/>
+    </w:pPr>
+  </w:style>
+  <w:style w:type="character" w:customStyle="1" w:styleId="PieddepageCar">
+    <w:name w:val="Pied de page Car"/>
+    <w:basedOn w:val="Policepardfaut"/>
+    <w:link w:val="Pieddepage"/>
+    <w:uiPriority w:val="99"/>
+    <w:rsid w:val="006128B6"/>
+  </w:style>
+  <w:style w:type="paragraph" w:styleId="En-ttedetabledesmatires">
+    <w:name w:val="TOC Heading"/>
+    <w:basedOn w:val="Titre1"/>
+    <w:next w:val="Normal"/>
+    <w:uiPriority w:val="39"/>
+    <w:unhideWhenUsed/>
+    <w:qFormat/>
+    <w:rsid w:val="00B33699"/>
+    <w:pPr>
+      <w:spacing w:before="240" w:after="0" w:line="259" w:lineRule="auto"/>
+      <w:outlineLvl w:val="9"/>
+    </w:pPr>
+    <w:rPr>
+      <w:kern w:val="0"/>
+      <w:sz w:val="32"/>
+      <w:szCs w:val="32"/>
+      <w:lang w:eastAsia="fr-FR"/>
+      <w14:ligatures w14:val="none"/>
+    </w:rPr>
+  </w:style>
+  <w:style w:type="paragraph" w:styleId="TM1">
+    <w:name w:val="toc 1"/>
+    <w:basedOn w:val="Normal"/>
+    <w:next w:val="Normal"/>
+    <w:autoRedefine/>
+    <w:uiPriority w:val="39"/>
+    <w:unhideWhenUsed/>
+    <w:rsid w:val="00B33699"/>
+    <w:pPr>
+      <w:spacing w:after="100"/>
+    </w:pPr>
+  </w:style>
+  <w:style w:type="paragraph" w:styleId="TM2">
+    <w:name w:val="toc 2"/>
+    <w:basedOn w:val="Normal"/>
+    <w:next w:val="Normal"/>
+    <w:autoRedefine/>
+    <w:uiPriority w:val="39"/>
+    <w:unhideWhenUsed/>
+    <w:rsid w:val="00B33699"/>
+    <w:pPr>
+      <w:spacing w:after="100"/>
+      <w:ind w:left="240"/>
+    </w:pPr>
+  </w:style>
+  <w:style w:type="paragraph" w:styleId="TM3">
+    <w:name w:val="toc 3"/>
+    <w:basedOn w:val="Normal"/>
+    <w:next w:val="Normal"/>
+    <w:autoRedefine/>
+    <w:uiPriority w:val="39"/>
+    <w:unhideWhenUsed/>
+    <w:rsid w:val="00B33699"/>
+    <w:pPr>
+      <w:spacing w:after="100"/>
+      <w:ind w:left="480"/>
+    </w:pPr>
+  </w:style>
+  <w:style w:type="character" w:styleId="Lienhypertexte">
+    <w:name w:val="Hyperlink"/>
+    <w:basedOn w:val="Policepardfaut"/>
+    <w:uiPriority w:val="99"/>
+    <w:unhideWhenUsed/>
+    <w:rsid w:val="00B33699"/>
+    <w:rPr>
+      <w:color w:val="467886" w:themeColor="hyperlink"/>
+      <w:u w:val="single"/>
     </w:rPr>
   </w:style>
 </w:styles>
@@ -6014,4 +10289,16 @@
     </a:ext>
   </a:extLst>
 </a:theme>
+</file>
+
+<file path=customXml/item1.xml><?xml version="1.0" encoding="utf-8"?>
+<b:Sources xmlns:b="http://schemas.openxmlformats.org/officeDocument/2006/bibliography" xmlns="http://schemas.openxmlformats.org/officeDocument/2006/bibliography" SelectedStyle="\APASixthEditionOfficeOnline.xsl" StyleName="APA" Version="6"/>
+</file>
+
+<file path=customXml/itemProps1.xml><?xml version="1.0" encoding="utf-8"?>
+<ds:datastoreItem xmlns:ds="http://schemas.openxmlformats.org/officeDocument/2006/customXml" ds:itemID="{A9A70CB3-1DA5-427D-96FE-6F3295A05C93}">
+  <ds:schemaRefs>
+    <ds:schemaRef ds:uri="http://schemas.openxmlformats.org/officeDocument/2006/bibliography"/>
+  </ds:schemaRefs>
+</ds:datastoreItem>
 </file>
</xml_diff>